<commit_message>
refactor of linkedin app
</commit_message>
<xml_diff>
--- a/src/static/resume.docx
+++ b/src/static/resume.docx
@@ -686,7 +686,7 @@
         <w:spacing w:after="100"/>
       </w:pPr>
       <w:r>
-        <w:t xml:space="preserve">TypeScript, Web3, dApps, Aurelia 2, Web Components, Wallets, MVVM, SPA, Fastify, JavaScript, TailWind CSS, Axios, Node.js, Awilix, TSyringe, Vite, HTML, CSS, Custom (HTML) Elements, Shadow DOM, HTML Templates, Data Binding, Observables, Pub/Sub Pattern, RxJS, SASS, Responsive UIs, Service-Oriented Architecture (SOA), ReactJs, Aurelia, AngularJs, FluentUI Web Components, Webpack, Rollup, C#, Markdown, XML, D3.js, Highcharts, ASP.NET Core, MVC, WebApi, ASP.NET Identity, Razor, Ajax, jQuery, Bootstrap, RequireJs, C++, Java, KnockoutJs, DurandalJs, ASP.NET, Enterprise Scale Web Applications, Telerik, Bootstrap Material Design, XSLT, XML Schema Definition (XSD), JSPM, SystemJs, WCF, WWF, Microsoft Extensibility Framework (MEF), JDBC, JSP, Swing, CORBA, Flash SWF, Xerces</w:t>
+        <w:t xml:space="preserve">TypeScript, Web3, dApps, Aurelia 2, Web Components, Wallets, MVVM, SPA, Fastify, JavaScript, TailWind CSS, Axios, Node.js, Awilix, TSyringe, Vite, HTML, CSS, Custom (HTML) Elements, Shadow DOM, HTML Templates, Data Binding, Observables, Pub/Sub Pattern, RxJS, SASS, Responsive UIs, Service-Oriented Architecture (SOA), React, Aurelia, AngularJS, FluentUI Web Components, Webpack, Rollup, C#, Markdown, XML, D3.js, Highcharts, ASP.NET Core, MVC, WebApi, ASP.NET Identity, Razor, Ajax, jQuery, Bootstrap, RequireJS, C++, Java, KnockoutJS, DurandalJs, ASP.NET, Enterprise Scale Web Applications, Telerik, Bootstrap Material Design, XSLT, XML Schema Definition (XSD), JSPM, SystemJS, WCF, WWF, Microsoft Extensibility Framework (MEF), JDBC, JSP, Swing, CORBA, Flash SWF, Xerces</w:t>
       </w:r>
     </w:p>
     <w:p>
@@ -754,7 +754,7 @@
         <w:spacing w:after="100"/>
       </w:pPr>
       <w:r>
-        <w:t xml:space="preserve">Vite, Webpack, Rollup, RequireJs, JSPM, SystemJs</w:t>
+        <w:t xml:space="preserve">Vite, Webpack, Rollup, RequireJS, JSPM, SystemJS</w:t>
       </w:r>
     </w:p>
     <w:p>
@@ -1862,7 +1862,7 @@
         <w:spacing w:after="100"/>
       </w:pPr>
       <w:r>
-        <w:t xml:space="preserve">TypeScript, Solidity, Ethereum, Web3, dApps, ethers.js, DAOs, DAO Governance Systems, DeFi, Wallets, ReFi, SPA, IPFS, Subgraph, Liquidity Bootstrapping Pools, web3.js, Balancer Liquidity Pools, Gnosis Safe, Defender, Ceramic, ENS, LitProtocol, Metamask, WalletConnect, Web3Modal, JavaScript, Node.js, Vite, HTML, CSS, SASS, Responsive, ReactJs, Aurelia, Webpack, Rollup, i18Next, GitHub</w:t>
+        <w:t xml:space="preserve">TypeScript, Solidity, Ethereum, Web3, dApps, ethers.js, DAOs, DAO Governance Systems, DeFi, Wallets, ReFi, SPA, IPFS, Subgraph, Liquidity Bootstrapping Pools, web3.js, Balancer Liquidity Pools, Gnosis Safe, Defender, Ceramic, ENS, LitProtocol, Metamask, WalletConnect, Web3Modal, JavaScript, Node.js, Vite, HTML, CSS, SASS, Responsive, React, Aurelia, Webpack, Rollup, i18Next, GitHub</w:t>
       </w:r>
     </w:p>
     <w:p>
@@ -2041,7 +2041,7 @@
         <w:spacing w:after="100"/>
       </w:pPr>
       <w:r>
-        <w:t xml:space="preserve">TypeScript, Solidity, Ethereum, Web3, dApps, DAOs, DAO Governance Systems, Wallets, SPA, Subgraph, 3Box, JavaScript, Node.js, HTML, CSS, SASS, Responsive, ReactJs, Aurelia, Webpack, jQuery, Bootstrap, Bootstrap Material Design, GitHub</w:t>
+        <w:t xml:space="preserve">TypeScript, Solidity, Ethereum, Web3, dApps, DAOs, DAO Governance Systems, Wallets, SPA, Subgraph, 3Box, JavaScript, Node.js, HTML, CSS, SASS, Responsive, React, Aurelia, Webpack, jQuery, Bootstrap, Bootstrap Material Design, GitHub</w:t>
       </w:r>
     </w:p>
     <w:p>
@@ -2375,7 +2375,7 @@
         <w:spacing w:after="60"/>
       </w:pPr>
       <w:r>
-        <w:t xml:space="preserve">The only part I didn't write entirely myself was the AngularJs web application</w:t>
+        <w:t xml:space="preserve">The only part I didn't write entirely myself was the AngularJS web application</w:t>
       </w:r>
     </w:p>
     <w:p>
@@ -2401,7 +2401,7 @@
         <w:spacing w:after="60"/>
       </w:pPr>
       <w:r>
-        <w:t xml:space="preserve">Integrated lots of moving parts: an AngularJs web application, two external web services, .NET web server, Azure web job, and SQL Server database</w:t>
+        <w:t xml:space="preserve">Integrated lots of moving parts: an AngularJS web application, two external web services, a .NET web server, Azure web job, and SQL Server database</w:t>
       </w:r>
     </w:p>
     <w:p>
@@ -2435,7 +2435,7 @@
         <w:spacing w:after="100"/>
       </w:pPr>
       <w:r>
-        <w:t xml:space="preserve">TypeScript, SPA, AngularJs, C#, WebApi, ASP.NET, SQL Server, T-SQL, Unity, Entity Framework, Azure, TFS</w:t>
+        <w:t xml:space="preserve">TypeScript, SPA, AngularJS, C#, WebApi, ASP.NET, SQL Server, T-SQL, Unity, Entity Framework, Azure, TFS</w:t>
       </w:r>
     </w:p>
     <w:p>
@@ -2575,7 +2575,7 @@
         <w:spacing w:after="100"/>
       </w:pPr>
       <w:r>
-        <w:t xml:space="preserve">SPA, JavaScript, HTML, CSS, C#, D3, Highcharts, WebApi, Ajax, jQuery, Bootstrap, RequireJs, KnockoutJs, DurandalJs, Agile, Unity, .NET, Entity Framework, TFS</w:t>
+        <w:t xml:space="preserve">SPA, JavaScript, HTML, CSS, C#, D3, Highcharts, WebApi, Ajax, jQuery, Bootstrap, RequireJS, KnockoutJS, DurandalJs, Agile, Unity, .NET, Entity Framework, TFS</w:t>
       </w:r>
     </w:p>
     <w:p>
@@ -2701,7 +2701,7 @@
         <w:spacing w:after="100"/>
       </w:pPr>
       <w:r>
-        <w:t xml:space="preserve">SPA, JavaScript, HTML, CSS, C#, MVC, WebAPI, Ajax, jQuery, bootstrap, RequireJs, KnockoutJs, Durandal, ASP.NET, i18Next, jQuery globalization, SQL Server, T-SQL, entity framework</w:t>
+        <w:t xml:space="preserve">SPA, JavaScript, HTML, CSS, C#, MVC, WebAPI, Ajax, jQuery, bootstrap, RequireJS, KnockoutJS, Durandal, ASP.NET, i18Next, jQuery globalization, SQL Server, T-SQL, entity framework</w:t>
       </w:r>
     </w:p>
     <w:p>
@@ -2780,7 +2780,7 @@
         <w:spacing w:after="60"/>
       </w:pPr>
       <w:r>
-        <w:t xml:space="preserve">Been through a couple iterations as technologies have changed. Was Durandal+KnockoutJs+MsTest+ASP.NET, is now Aurelia+XUnit+ASP.NET Core.</w:t>
+        <w:t xml:space="preserve">Been through a couple iterations as technologies have changed. Was Durandal+KnockoutJS+MsTest+ASP.NET, is now Aurelia+XUnit+ASP.NET Core.</w:t>
       </w:r>
     </w:p>
     <w:p>
@@ -2801,7 +2801,7 @@
         <w:spacing w:after="100"/>
       </w:pPr>
       <w:r>
-        <w:t xml:space="preserve">SPA, JavaScript, HTML, CSS, Aurelia, Webpack, C#, ASP.NET Core, MVC, WebAPI, Identity, Ajax, jQuery, Bootstrap, RequireJs, KnockoutJs, SQL Server, T-SQL, MsTest, XUnit.NET, crypto-js, DES, Encryption, SHA, System.Security.Cryptography, entity framework</w:t>
+        <w:t xml:space="preserve">SPA, JavaScript, HTML, CSS, Aurelia, Webpack, C#, ASP.NET Core, MVC, WebAPI, Identity, Ajax, jQuery, Bootstrap, RequireJS, KnockoutJS, SQL Server, T-SQL, MsTest, XUnit.NET, crypto-js, DES, Encryption, SHA, System.Security.Cryptography, entity framework</w:t>
       </w:r>
     </w:p>
     <w:p>
@@ -2967,7 +2967,7 @@
         <w:spacing w:after="100"/>
       </w:pPr>
       <w:r>
-        <w:t xml:space="preserve">JavaScript, HTML, CSS, C#, MVC, jQuery, KnockoutJs, ASP.NET, Telerik, MEF, ADO, nHibernate, Agile, Moq, Selenium, SpecFlow, Unity, VSTest, Enterprise Framework, TFS</w:t>
+        <w:t xml:space="preserve">JavaScript, HTML, CSS, C#, MVC, jQuery, KnockoutJS, ASP.NET, Telerik, MEF, ADO, nHibernate, Agile, Moq, Selenium, SpecFlow, Unity, VSTest, Enterprise Framework, TFS</w:t>
       </w:r>
     </w:p>
     <w:p>
@@ -4117,7 +4117,7 @@
         <w:spacing w:after="100"/>
       </w:pPr>
       <w:r>
-        <w:t xml:space="preserve">Developed software for Toolbook 3.0 and multimedia screensavers (Jurassic Park, et. al.)</w:t>
+        <w:t xml:space="preserve">Developed software for Toolbook 3.0 and multimedia screensavers (Jurassic Park, et al.)</w:t>
       </w:r>
     </w:p>
     <w:p>
@@ -4211,7 +4211,7 @@
         <w:spacing w:after="100"/>
       </w:pPr>
       <w:r>
-        <w:t xml:space="preserve">Managed all development efforts (see ConnectSoft, below)</w:t>
+        <w:t xml:space="preserve">Managed all ConnectSoft development efforts</w:t>
       </w:r>
     </w:p>
     <w:p>

</xml_diff>

<commit_message>
added hyperDao Ethlisbon hackathon
</commit_message>
<xml_diff>
--- a/src/static/resume.docx
+++ b/src/static/resume.docx
@@ -677,7 +677,7 @@
         <w:spacing w:after="100"/>
       </w:pPr>
       <w:r>
-        <w:t xml:space="preserve">Solidity, Ethereum, Web3, dApps, ethers.js, DAOs, DAO Governance Systems, DeFi, Wallets, ReFi, IPFS, Subgraph, Liquidity Bootstrapping Pools, web3.js, Celo, Arbitrum, Balancer Liquidity Pools, Gnosis Safe, OpenZeppelin Defender, Ceramic, 3Box, ENS, Mento, LitProtocol, Metamask, WalletConnect, Web3Modal</w:t>
+        <w:t xml:space="preserve">Blockchain, Cryptocurrencies, Solidity, Ethereum, Web3, dApps, ethers.js, DAOs, DAO Governance Systems, DeFi, Wallets, ReFi, IPFS, Subgraph, Liquidity Bootstrapping Pools, web3.js, Celo, Arbitrum, Balancer Liquidity Pools, Gnosis Safe, OpenZeppelin Defender, Ceramic, 3Box, ENS, Mento, LitProtocol, Metamask, WalletConnect, Web3Modal</w:t>
       </w:r>
     </w:p>
     <w:p>
@@ -1307,7 +1307,7 @@
         <w:spacing w:after="100"/>
       </w:pPr>
       <w:r>
-        <w:t xml:space="preserve">TypeScript, Aurelia 2, DeFi, MVVM, AI Coding Assistant, GitHub Copilot, TailWind CSS, Axios, Vite, FluentUI Web Components, GitHub</w:t>
+        <w:t xml:space="preserve">TypeScript, Blockchain, Cryptocurrencies, Aurelia 2, DeFi, MVVM, AI Coding Assistant, GitHub Copilot, TailWind CSS, Axios, Vite, FluentUI Web Components, GitHub</w:t>
       </w:r>
     </w:p>
     <w:p>
@@ -1486,7 +1486,7 @@
         <w:spacing w:after="100"/>
       </w:pPr>
       <w:r>
-        <w:t xml:space="preserve">TypeScript, DeFi, AI Coding Assistant, GitHub Copilot, Fastify, Axios, Node.js, TSyringe, Vite, GitHub</w:t>
+        <w:t xml:space="preserve">TypeScript, Blockchain, Cryptocurrencies, DeFi, AI Coding Assistant, GitHub Copilot, Fastify, Axios, Node.js, TSyringe, Vite, GitHub</w:t>
       </w:r>
     </w:p>
     <w:p>
@@ -1870,7 +1870,7 @@
         <w:spacing w:after="100"/>
       </w:pPr>
       <w:r>
-        <w:t xml:space="preserve">TypeScript, Solidity, Ethereum, Web3, dApps, ethers.js, DAOs, DAO Governance Systems, DeFi, Wallets, ReFi, SPA, IPFS, Subgraph, Liquidity Bootstrapping Pools, web3.js, Balancer Liquidity Pools, Gnosis Safe, Defender, Ceramic, ENS, LitProtocol, Metamask, WalletConnect, Web3Modal, JavaScript, Node.js, Vite, HTML, CSS, SASS, Responsive, React, Aurelia, Webpack, Rollup, i18Next, GitHub</w:t>
+        <w:t xml:space="preserve">TypeScript, Blockchain, Cryptocurrencies, Solidity, Ethereum, Web3, dApps, ethers.js, DAOs, DAO Governance Systems, DeFi, Wallets, ReFi, SPA, IPFS, Subgraph, Liquidity Bootstrapping Pools, web3.js, Balancer Liquidity Pools, Gnosis Safe, Defender, Ceramic, ENS, LitProtocol, Metamask, WalletConnect, Web3Modal, JavaScript, Node.js, Vite, HTML, CSS, SASS, Responsive, React, Aurelia, Webpack, Rollup, i18Next, GitHub</w:t>
       </w:r>
     </w:p>
     <w:p>
@@ -2049,7 +2049,7 @@
         <w:spacing w:after="100"/>
       </w:pPr>
       <w:r>
-        <w:t xml:space="preserve">TypeScript, Solidity, Ethereum, Web3, dApps, DAOs, DAO Governance Systems, Wallets, SPA, Subgraph, 3Box, JavaScript, Node.js, HTML, CSS, SASS, Responsive, React, Aurelia, Webpack, jQuery, Bootstrap, Bootstrap Material Design, GitHub</w:t>
+        <w:t xml:space="preserve">TypeScript, Blockchain, Solidity, Ethereum, Web3, dApps, DAOs, DAO Governance Systems, Wallets, SPA, Subgraph, 3Box, JavaScript, Node.js, HTML, CSS, SASS, Responsive, React, Aurelia, Webpack, jQuery, Bootstrap, Bootstrap Material Design, GitHub</w:t>
       </w:r>
     </w:p>
     <w:p>

</xml_diff>

<commit_message>
fix bug from admin
</commit_message>
<xml_diff>
--- a/src/static/resume.docx
+++ b/src/static/resume.docx
@@ -1850,6 +1850,19 @@
       </w:pPr>
       <w:r>
         <w:t xml:space="preserve">As products, these applications are innovative and impressive. Read more about them at Kolektivo (https://www.kolektivo.network/) and The Prime Suite (https://www.prime.xyz)</w:t>
+      </w:r>
+    </w:p>
+    <w:p>
+      <w:pPr>
+        <w:pStyle w:val="ListParagraph"/>
+        <w:numPr>
+          <w:ilvl w:val="0"/>
+          <w:numId w:val="1"/>
+        </w:numPr>
+        <w:spacing w:after="60"/>
+      </w:pPr>
+      <w:r>
+        <w:t xml:space="preserve">Sole coder of the dApp frontend of HyperDAO (https://github.com/Curve-Labs/hyperdao), built in three days with the Curve Labs team at the ETHLisbon 2021 hackathon and awarded a prize; the frontend created DAOs and submitted proposals against a Gnosis Safe acting as a minimal viable DAO, turning Telegram groups into functioning DAOs</w:t>
       </w:r>
     </w:p>
     <w:p>

</xml_diff>

<commit_message>
Retitle the self-directed Human Lens and Butterfly roles
Human Lens becomes "Applied AI Engineer & Architect", and both Butterfly
entries become "Product Engineer & Architect". Employer roles keep their
employers' titles. Regenerated resume.txt, resume.docx, the JSON-LD and
the prerender snapshot, and updated the example title quoted in
resume-jsonld-plugin.ts.

Co-Authored-By: Claude Opus 5.5 <noreply@anthropic.com>
</commit_message>
<xml_diff>
--- a/src/static/resume.docx
+++ b/src/static/resume.docx
@@ -985,7 +985,7 @@
         <w:keepLines/>
       </w:pPr>
       <w:r>
-        <w:t xml:space="preserve">Technical Lead &amp; LLM Pipeline Architect — Human Lens, AI-native web app</w:t>
+        <w:t xml:space="preserve">Applied AI Engineer &amp; Architect — Human Lens, AI-native qualitative analysis app</w:t>
       </w:r>
     </w:p>
     <w:p>
@@ -1177,7 +1177,7 @@
         <w:keepLines/>
       </w:pPr>
       <w:r>
-        <w:t xml:space="preserve">Technical Lead &amp; dApp Architect — Butterfly, Crypto portfolio management dApp</w:t>
+        <w:t xml:space="preserve">Product Engineer &amp; Architect — Butterfly, crypto portfolio management dApp</w:t>
       </w:r>
     </w:p>
     <w:p>
@@ -1317,7 +1317,7 @@
         <w:keepLines/>
       </w:pPr>
       <w:r>
-        <w:t xml:space="preserve">Technical Lead &amp; dApp Architect — Butterfly, Crypto portfolio management service</w:t>
+        <w:t xml:space="preserve">Product Engineer &amp; Architect — Butterfly, crypto portfolio management service</w:t>
       </w:r>
     </w:p>
     <w:p>

</xml_diff>

<commit_message>
Rewrite the featured position summaries
The Human Lens, Butterfly dApp and Butterfly service summaries now
state end-to-end ownership, and Curve Labs and DAOstack open as first
front-end engineer. Regenerated resume.txt, resume.docx, the JSON-LD
and the prerender snapshot.

Co-Authored-By: Claude Opus 5.5 <noreply@anthropic.com>
</commit_message>
<xml_diff>
--- a/src/static/resume.docx
+++ b/src/static/resume.docx
@@ -1029,7 +1029,7 @@
         <w:spacing w:after="100"/>
       </w:pPr>
       <w:r>
-        <w:t xml:space="preserve">Turned an open-ended qualitative analysis problem into a full-stack web application wrapping a bounded, testable LLM pipeline: staged contracts between components, empirical calibration to reduce output variance, and a client-safe boundary enforced from the pipeline through to the human-review interface. Modeled on the practice of an existing DEI consultancy.</w:t>
+        <w:t xml:space="preserve">Translated a firm's manual qualitative analysis practice into a full-stack web application wrapping a bounded, testable LLM pipeline: staged contracts between components, empirical calibration to reduce output variance, and a client-safe boundary enforced from the pipeline through to the human-review interface. Owned design, architecture, implementation, and QA end to end. Modeled on the practice of an existing DEI consultancy.</w:t>
       </w:r>
     </w:p>
     <w:p>
@@ -1221,7 +1221,7 @@
         <w:spacing w:after="100"/>
       </w:pPr>
       <w:r>
-        <w:t xml:space="preserve">Designed and built a cryptocurrency portfolio management dApp that executes scaled take-profit sales across multiple exchanges. Supported by the Butterfly Crypto portfolio management service.</w:t>
+        <w:t xml:space="preserve">Designed and built a cryptocurrency portfolio management dApp that executes scaled take-profit sales across multiple exchanges, owning design, architecture, implementation, and QA end to end. Supported by the Butterfly Crypto portfolio management service.</w:t>
       </w:r>
     </w:p>
     <w:p>
@@ -1361,7 +1361,7 @@
         <w:spacing w:after="100"/>
       </w:pPr>
       <w:r>
-        <w:t xml:space="preserve">Designed and built a REST API service supporting secure cryptocurrency exchange operations across multiple exchanges. Supports the Butterfly Crypto portfolio management dApp.</w:t>
+        <w:t xml:space="preserve">Designed and built a REST API service supporting secure cryptocurrency exchange operations across multiple exchanges, owning design, architecture, implementation, and QA end to end. Supports the Butterfly Crypto portfolio management dApp.</w:t>
       </w:r>
     </w:p>
     <w:p>
@@ -1693,7 +1693,7 @@
         <w:spacing w:after="100"/>
       </w:pPr>
       <w:r>
-        <w:t xml:space="preserve">Led teams of 2-5 in the development of the frontends of multiple dApps running against the Ethereum blockchain focused on decentralized (DeFi) and regenerative finance (ReFi). Among others, led the development team for a ReFi dApp designed to emerge a regenerative, decentralized economic system for the sovereign island nation of Curaçao.</w:t>
+        <w:t xml:space="preserve">First front-end engineer at Curve Labs, owning design, architecture, implementation, and QA end to end for the frontends of multiple dApps on the Ethereum blockchain focused on decentralized (DeFi) and regenerative finance (ReFi), while leading teams of 2-5 developers. Among others, led the development team for a ReFi dApp designed to emerge a regenerative, decentralized economic system for the sovereign island nation of Curaçao.</w:t>
       </w:r>
     </w:p>
     <w:p>
@@ -1937,7 +1937,7 @@
         <w:spacing w:after="100"/>
       </w:pPr>
       <w:r>
-        <w:t xml:space="preserve">Performed multiple development roles in the design, creation and use of DAOstack DAOs, one of the first major DAO designs in the history of DAOs. Used, reviewed and deployed Solidity smart contracts, wrote a TypeScript library to support dApps in accessing the smart contracts, wrote a test dApp, significantly contributed to the dApp Alchemy used for working with the DAOs.</w:t>
+        <w:t xml:space="preserve">First front-end engineer at DAOstack, one of the first major DAO designs in the history of DAOs, owning design, architecture, implementation, and QA end to end across multiple roles: used, reviewed and deployed Solidity smart contracts, wrote a TypeScript library to support dApps in accessing the smart contracts, wrote a test dApp, and significantly contributed to Alchemy, the dApp used for working with the DAOs.</w:t>
       </w:r>
     </w:p>
     <w:p>

</xml_diff>

<commit_message>
Split AI tooling into assisted and agentic development
Retire the "AI Coding Assistant" skill, a near-duplicate of AI-Assisted
Development, which now carries its url and keeps the old name as an
alias. Butterfly (2025) lists AI-Assisted Development; Human Lens (2026)
lists the new Agentic Software Development (priority 0.165, just ahead
of AI-Assisted Development). Regenerated resume.txt, resume.docx, the
JSON-LD and the prerender snapshot.

Co-Authored-By: Claude Opus 5.5 <noreply@anthropic.com>
</commit_message>
<xml_diff>
--- a/src/static/resume.docx
+++ b/src/static/resume.docx
@@ -660,7 +660,7 @@
         <w:spacing w:after="100"/>
       </w:pPr>
       <w:r>
-        <w:t xml:space="preserve">LLM Pipeline Architecture, LLM Evaluation, Human-in-the-Loop Design, Prompt Engineering, AI-Assisted Development, De-identification, Claude Code for VS Code, LLM APIs, AI Coding Assistant, Claude.ai (LLM), GitHub Copilot, ChatGPT (LLM)</w:t>
+        <w:t xml:space="preserve">LLM Pipeline Architecture, LLM Evaluation, Human-in-the-Loop Design, Prompt Engineering, Agentic Software Development, AI-Assisted Development, De-identification, Claude Code for VS Code, LLM APIs, Claude.ai (LLM), GitHub Copilot, ChatGPT (LLM)</w:t>
       </w:r>
     </w:p>
     <w:p>
@@ -1167,7 +1167,7 @@
         <w:spacing w:after="100"/>
       </w:pPr>
       <w:r>
-        <w:t xml:space="preserve">LLM Pipeline Architecture, LLM Evaluation, TypeScript, Human-in-the-Loop Design, Prompt Engineering, AI-Assisted Development, De-identification, Aurelia 2, Claude Code for VS Code, LLM APIs, AI Coding Assistant, Claude.ai (LLM), GitHub Copilot, ChatGPT (LLM), Fastify, TailWind CSS, Axios, Node.js, Awilix, Vite, HTML, Visual Studio Code, Vitest, NPM</w:t>
+        <w:t xml:space="preserve">LLM Pipeline Architecture, LLM Evaluation, TypeScript, Human-in-the-Loop Design, Prompt Engineering, Agentic Software Development, De-identification, Aurelia 2, Claude Code for VS Code, LLM APIs, Claude.ai (LLM), GitHub Copilot, ChatGPT (LLM), Fastify, TailWind CSS, Axios, Node.js, Awilix, Vite, HTML, Visual Studio Code, Vitest, NPM</w:t>
       </w:r>
     </w:p>
     <w:p>
@@ -1307,7 +1307,7 @@
         <w:spacing w:after="100"/>
       </w:pPr>
       <w:r>
-        <w:t xml:space="preserve">TypeScript, Blockchain, Cryptocurrencies, Aurelia 2, DeFi, MVVM, AI Coding Assistant, GitHub Copilot, TailWind CSS, Axios, Vite, FluentUI Web Components, GitHub</w:t>
+        <w:t xml:space="preserve">TypeScript, Blockchain, Cryptocurrencies, AI-Assisted Development, Aurelia 2, DeFi, MVVM, GitHub Copilot, TailWind CSS, Axios, Vite, FluentUI Web Components, GitHub</w:t>
       </w:r>
     </w:p>
     <w:p>
@@ -1486,7 +1486,7 @@
         <w:spacing w:after="100"/>
       </w:pPr>
       <w:r>
-        <w:t xml:space="preserve">TypeScript, Blockchain, Cryptocurrencies, DeFi, AI Coding Assistant, GitHub Copilot, Fastify, Axios, Node.js, TSyringe, Vite, GitHub</w:t>
+        <w:t xml:space="preserve">TypeScript, Blockchain, Cryptocurrencies, AI-Assisted Development, DeFi, GitHub Copilot, Fastify, Axios, Node.js, TSyringe, Vite, GitHub</w:t>
       </w:r>
     </w:p>
     <w:p>

</xml_diff>

<commit_message>
Add practice and leadership skills to the featured roles
New "Engineering Practice & Leadership" category, second after AI,
and 23 new skills across AI, practice, Blockchain and web. Applied AI,
End-to-End Product Ownership and Technical Leadership rank under 1.0
and join the LinkedIn profile list; the rest rank 1.0 or above.
Added to Human Lens, both Butterfly entries, Curve Labs, DAOstack and
ShiftWise. Regenerated resume.txt, resume.docx, the JSON-LD and the
prerender snapshot.

Co-Authored-By: Claude Opus 5.5 <noreply@anthropic.com>
</commit_message>
<xml_diff>
--- a/src/static/resume.docx
+++ b/src/static/resume.docx
@@ -660,7 +660,7 @@
         <w:spacing w:after="100"/>
       </w:pPr>
       <w:r>
-        <w:t xml:space="preserve">LLM Pipeline Architecture, LLM Evaluation, Human-in-the-Loop Design, Prompt Engineering, Agentic Software Development, AI-Assisted Development, De-identification, Claude Code for VS Code, LLM APIs, Claude.ai (LLM), GitHub Copilot, ChatGPT (LLM)</w:t>
+        <w:t xml:space="preserve">LLM Pipeline Architecture, LLM Evaluation, Applied AI, Human-in-the-Loop Design, Prompt Engineering, Agentic Software Development, AI-Assisted Development, De-identification, Claude Code for VS Code, LLM Orchestration, AI Product Development, Non-Deterministic System Testing, Synthetic Data Generation, Responsible AI, LLM APIs, Claude.ai (LLM), GitHub Copilot, ChatGPT (LLM)</w:t>
       </w:r>
     </w:p>
     <w:p>
@@ -669,6 +669,23 @@
         <w:keepNext/>
       </w:pPr>
       <w:r>
+        <w:t xml:space="preserve">Engineering Practice &amp; Leadership</w:t>
+      </w:r>
+    </w:p>
+    <w:p>
+      <w:pPr>
+        <w:spacing w:after="100"/>
+      </w:pPr>
+      <w:r>
+        <w:t xml:space="preserve">End-to-End Product Ownership, Technical Leadership, Team Leadership, Mentoring, Technical Interviewing, Requirements Analysis, Domain Modeling, Code Review, Prototyping, Client Integration</w:t>
+      </w:r>
+    </w:p>
+    <w:p>
+      <w:pPr>
+        <w:pStyle w:val="Heading2"/>
+        <w:keepNext/>
+      </w:pPr>
+      <w:r>
         <w:t xml:space="preserve">Blockchain</w:t>
       </w:r>
     </w:p>
@@ -677,7 +694,7 @@
         <w:spacing w:after="100"/>
       </w:pPr>
       <w:r>
-        <w:t xml:space="preserve">Blockchain, Cryptocurrencies, Solidity, Ethereum, Web3, dApps, ethers.js, DAOs, DAO Governance Systems, DeFi, Wallets, ReFi, IPFS, Subgraph, Liquidity Bootstrapping Pools, web3.js, Celo, Arbitrum, Balancer Liquidity Pools, Gnosis Safe, OpenZeppelin Defender, Ceramic, 3Box, ENS, Mento, LitProtocol, Metamask, WalletConnect, Web3Modal</w:t>
+        <w:t xml:space="preserve">Blockchain, Cryptocurrencies, Solidity, Ethereum, Web3, dApps, ethers.js, DAOs, DAO Governance Systems, DeFi, Wallets, ReFi, IPFS, Subgraph, Liquidity Bootstrapping Pools, Smart Contract Security Review, Smart Contract Deployment, web3.js, Celo, Arbitrum, Balancer Liquidity Pools, Gnosis Safe, OpenZeppelin Defender, Ceramic, 3Box, ENS, Mento, LitProtocol, Metamask, WalletConnect, Web3Modal</w:t>
       </w:r>
     </w:p>
     <w:p>
@@ -694,7 +711,7 @@
         <w:spacing w:after="100"/>
       </w:pPr>
       <w:r>
-        <w:t xml:space="preserve">TypeScript, Web3, dApps, Aurelia 2, Web Components, Wallets, MVVM, SPA, Fastify, JavaScript, TailWind CSS, Axios, Node.js, Awilix, TSyringe, Vite, HTML, CSS, Custom (HTML) Elements, Shadow DOM, HTML Templates, Data Binding, Observables, Pub/Sub Pattern, RxJS, SASS, Responsive UIs, Service-Oriented Architecture (SOA), React, Aurelia, AngularJS, FluentUI Web Components, Webpack, Rollup, C#, Markdown, XML, D3.js, Highcharts, ASP.NET Core, MVC, WebApi, ASP.NET Identity, Razor, Ajax, jQuery, Bootstrap, RequireJS, C++, Java, KnockoutJS, DurandalJs, ASP.NET, Enterprise Scale Web Applications, Telerik, Bootstrap Material Design, XSLT, XML Schema Definition (XSD), JSPM, SystemJS, WCF, WWF, Microsoft Extensibility Framework (MEF), JDBC, JSP, Swing, CORBA, Flash SWF, Xerces</w:t>
+        <w:t xml:space="preserve">TypeScript, Web3, dApps, Aurelia 2, Web Components, Wallets, MVVM, SPA, API Design, SDK/Library Design, Systems Integration, OpenAPI, Exchange API Integration, Fastify, JavaScript, TailWind CSS, Axios, Node.js, Awilix, TSyringe, Vite, HTML, CSS, Custom (HTML) Elements, Shadow DOM, HTML Templates, Data Binding, Observables, Pub/Sub Pattern, RxJS, SASS, Responsive UIs, Service-Oriented Architecture (SOA), React, Aurelia, AngularJS, FluentUI Web Components, Webpack, Rollup, C#, Markdown, XML, D3.js, Highcharts, ASP.NET Core, MVC, WebApi, ASP.NET Identity, Razor, Ajax, jQuery, Bootstrap, RequireJS, C++, Java, KnockoutJS, DurandalJs, ASP.NET, Enterprise Scale Web Applications, Telerik, Bootstrap Material Design, XSLT, XML Schema Definition (XSD), JSPM, SystemJS, WCF, WWF, Microsoft Extensibility Framework (MEF), JDBC, JSP, Swing, CORBA, Flash SWF, Xerces</w:t>
       </w:r>
     </w:p>
     <w:p>
@@ -1167,7 +1184,7 @@
         <w:spacing w:after="100"/>
       </w:pPr>
       <w:r>
-        <w:t xml:space="preserve">LLM Pipeline Architecture, LLM Evaluation, TypeScript, Human-in-the-Loop Design, Prompt Engineering, Agentic Software Development, De-identification, Aurelia 2, Claude Code for VS Code, LLM APIs, Claude.ai (LLM), GitHub Copilot, ChatGPT (LLM), Fastify, TailWind CSS, Axios, Node.js, Awilix, Vite, HTML, Visual Studio Code, Vitest, NPM</w:t>
+        <w:t xml:space="preserve">LLM Pipeline Architecture, LLM Evaluation, Applied AI, TypeScript, Human-in-the-Loop Design, Prompt Engineering, Agentic Software Development, De-identification, End-to-End Product Ownership, Aurelia 2, Claude Code for VS Code, LLM Orchestration, AI Product Development, Non-Deterministic System Testing, Synthetic Data Generation, Responsible AI, LLM APIs, Claude.ai (LLM), GitHub Copilot, ChatGPT (LLM), Requirements Analysis, Domain Modeling, Fastify, TailWind CSS, Axios, Node.js, Awilix, Vite, HTML, Visual Studio Code, Vitest, NPM</w:t>
       </w:r>
     </w:p>
     <w:p>
@@ -1307,7 +1324,7 @@
         <w:spacing w:after="100"/>
       </w:pPr>
       <w:r>
-        <w:t xml:space="preserve">TypeScript, Blockchain, Cryptocurrencies, AI-Assisted Development, Aurelia 2, DeFi, MVVM, GitHub Copilot, TailWind CSS, Axios, Vite, FluentUI Web Components, GitHub</w:t>
+        <w:t xml:space="preserve">TypeScript, Blockchain, Cryptocurrencies, AI-Assisted Development, End-to-End Product Ownership, Aurelia 2, DeFi, MVVM, GitHub Copilot, TailWind CSS, Axios, Vite, FluentUI Web Components, GitHub</w:t>
       </w:r>
     </w:p>
     <w:p>
@@ -1486,7 +1503,7 @@
         <w:spacing w:after="100"/>
       </w:pPr>
       <w:r>
-        <w:t xml:space="preserve">TypeScript, Blockchain, Cryptocurrencies, AI-Assisted Development, DeFi, GitHub Copilot, Fastify, Axios, Node.js, TSyringe, Vite, GitHub</w:t>
+        <w:t xml:space="preserve">TypeScript, Blockchain, Cryptocurrencies, AI-Assisted Development, End-to-End Product Ownership, DeFi, GitHub Copilot, API Design, OpenAPI, Exchange API Integration, Fastify, Axios, Node.js, TSyringe, Vite, GitHub</w:t>
       </w:r>
     </w:p>
     <w:p>
@@ -1883,7 +1900,7 @@
         <w:spacing w:after="100"/>
       </w:pPr>
       <w:r>
-        <w:t xml:space="preserve">TypeScript, Blockchain, Cryptocurrencies, Solidity, Ethereum, Web3, dApps, ethers.js, DAOs, DAO Governance Systems, DeFi, Wallets, ReFi, SPA, IPFS, Subgraph, Liquidity Bootstrapping Pools, web3.js, Balancer Liquidity Pools, Gnosis Safe, Defender, Ceramic, ENS, LitProtocol, Metamask, WalletConnect, Web3Modal, JavaScript, Node.js, Vite, HTML, CSS, SASS, Responsive, React, Aurelia, Webpack, Rollup, i18Next, GitHub</w:t>
+        <w:t xml:space="preserve">TypeScript, Blockchain, Cryptocurrencies, Solidity, Ethereum, Web3, dApps, End-to-End Product Ownership, Technical Leadership, ethers.js, DAOs, DAO Governance Systems, DeFi, Wallets, ReFi, SPA, IPFS, Subgraph, Liquidity Bootstrapping Pools, Technical Interviewing, Code Review, Smart Contract Security Review, web3.js, Balancer Liquidity Pools, Gnosis Safe, Defender, Ceramic, ENS, LitProtocol, Metamask, WalletConnect, Web3Modal, JavaScript, Node.js, Vite, HTML, CSS, SASS, Responsive, React, Aurelia, Webpack, Rollup, i18Next, GitHub</w:t>
       </w:r>
     </w:p>
     <w:p>
@@ -2062,7 +2079,7 @@
         <w:spacing w:after="100"/>
       </w:pPr>
       <w:r>
-        <w:t xml:space="preserve">TypeScript, Blockchain, Solidity, Ethereum, Web3, dApps, DAOs, DAO Governance Systems, Wallets, SPA, Subgraph, 3Box, JavaScript, Node.js, HTML, CSS, SASS, Responsive, React, Aurelia, Webpack, jQuery, Bootstrap, Bootstrap Material Design, GitHub</w:t>
+        <w:t xml:space="preserve">TypeScript, Blockchain, Solidity, Ethereum, Web3, dApps, End-to-End Product Ownership, DAOs, DAO Governance Systems, Wallets, SPA, Subgraph, Prototyping, Smart Contract Deployment, 3Box, SDK/Library Design, JavaScript, Node.js, HTML, CSS, SASS, Responsive, React, Aurelia, Webpack, jQuery, Bootstrap, Bootstrap Material Design, GitHub</w:t>
       </w:r>
     </w:p>
     <w:p>
@@ -3154,7 +3171,7 @@
         <w:spacing w:after="100"/>
       </w:pPr>
       <w:r>
-        <w:t xml:space="preserve">JavaScript, HTML, CSS, C#, XML, MVC, jQuery, ASP.NET, XSLT, XSD, WCF, WWF, SQL Server, T-SQL, LINQ, Agile, Moq, MSTest, NUnit, Entity Framework, Enterprise Framework, TFS</w:t>
+        <w:t xml:space="preserve">Team Leadership, Mentoring, Client Integration, Systems Integration, JavaScript, HTML, CSS, C#, XML, MVC, jQuery, ASP.NET, XSLT, XSD, WCF, WWF, SQL Server, T-SQL, LINQ, Agile, Moq, MSTest, NUnit, Entity Framework, Enterprise Framework, TFS</w:t>
       </w:r>
     </w:p>
     <w:p>

</xml_diff>

<commit_message>
Rewrite the introduction and headline fields; add Curve Labs mentoring
New label, metaTitle, metaDescription and bio, and the Introduction
paragraphs (summary1, summary2, summary7, summary8) reframed around
end-to-end ownership and applied AI. Curve Labs gains a mentoring
highlight and the Mentoring skill. Updated the comments that quoted
the old label and introduction. Regenerated resume.txt, resume.docx,
the JSON-LD and the prerender snapshot.

Co-Authored-By: Claude Opus 5.5 <noreply@anthropic.com>
</commit_message>
<xml_diff>
--- a/src/static/resume.docx
+++ b/src/static/resume.docx
@@ -16,7 +16,7 @@
         <w:spacing w:after="0"/>
       </w:pPr>
       <w:r>
-        <w:t xml:space="preserve">Full-stack Software Engineer &amp; Architect · LLM Systems, Blockchain</w:t>
+        <w:t xml:space="preserve">Applied AI Engineer &amp; Software Architect · LLM Systems, Full-Stack, Blockchain</w:t>
       </w:r>
     </w:p>
     <w:p>
@@ -84,31 +84,31 @@
         <w:spacing w:after="100"/>
       </w:pPr>
       <w:r>
-        <w:t xml:space="preserve">I am a software engineer and architect who has been building software professionally since 1985 — leading teams and building sophisticated systems across web applications, blockchain and Web3 platforms, and most recently AI-native applications built on large language models.</w:t>
-      </w:r>
-    </w:p>
-    <w:p>
-      <w:pPr>
-        <w:spacing w:after="100"/>
-      </w:pPr>
-      <w:r>
-        <w:t xml:space="preserve">I have worn multiple hats in important roles across many kinds of organizations, from Microsoft to garage startups — enough to recognize most problems before they become expensive.</w:t>
-      </w:r>
-    </w:p>
-    <w:p>
-      <w:pPr>
-        <w:spacing w:after="100"/>
-      </w:pPr>
-      <w:r>
-        <w:t xml:space="preserve">My recent work is in LLM system architecture and development — building reliable systems on top of subjective inputs and non-deterministic models.</w:t>
-      </w:r>
-    </w:p>
-    <w:p>
-      <w:pPr>
-        <w:spacing w:after="100"/>
-      </w:pPr>
-      <w:r>
-        <w:t xml:space="preserve">I'm looking for a senior engineering or architecture role where a long and varied track record is an asset. I work remotely from Costa Rica, which overlaps well with US business hours, and am happy to travel as needed.</w:t>
+        <w:t xml:space="preserve">I am a software engineer and architect who takes a project across all its dimensions: the people it serves, the context it has to work in, its design and architecture, the build, and the proof that it works. Startups have repeatedly brought me in as their first engineer, and I have been building software professionally since 1985, across web applications, blockchain and Web3 platforms, and AI-native applications.</w:t>
+      </w:r>
+    </w:p>
+    <w:p>
+      <w:pPr>
+        <w:spacing w:after="100"/>
+      </w:pPr>
+      <w:r>
+        <w:t xml:space="preserve">I have worn multiple hats in important roles across many kinds of organizations, from Microsoft to garage startups — enough to recognize most problems before they become expensive. I have managed teams, but I do my best work as a hands-on technical lead, including mentoring the developers around me.</w:t>
+      </w:r>
+    </w:p>
+    <w:p>
+      <w:pPr>
+        <w:spacing w:after="100"/>
+      </w:pPr>
+      <w:r>
+        <w:t xml:space="preserve">My recent work is applied AI: AI-native applications in which language models do the core work, built to be reliable on top of subjective inputs and non-deterministic models. That means evaluation that measures what a model invents as well as what it misses, and a person approving anything that reaches a client.</w:t>
+      </w:r>
+    </w:p>
+    <w:p>
+      <w:pPr>
+        <w:spacing w:after="100"/>
+      </w:pPr>
+      <w:r>
+        <w:t xml:space="preserve">I'm looking for a senior individual-contributor role in applied or forward-deployed AI, architecture, or staff-level engineering, where I can own a problem end to end, whether at an established company bringing AI into its products or at an AI-native one. I work remotely from Costa Rica, which overlaps well with US business hours, and am happy to travel as needed.</w:t>
       </w:r>
     </w:p>
     <w:p>
@@ -1879,6 +1879,19 @@
         <w:spacing w:after="60"/>
       </w:pPr>
       <w:r>
+        <w:t xml:space="preserve">Mentored junior developers on the dApp teams, both in coding and in working as a professional developer more broadly</w:t>
+      </w:r>
+    </w:p>
+    <w:p>
+      <w:pPr>
+        <w:pStyle w:val="ListParagraph"/>
+        <w:numPr>
+          <w:ilvl w:val="0"/>
+          <w:numId w:val="1"/>
+        </w:numPr>
+        <w:spacing w:after="60"/>
+      </w:pPr>
+      <w:r>
         <w:t xml:space="preserve">As products, these applications are innovative and impressive. Read more about them at Kolektivo (https://www.kolektivo.network/) and The Prime Suite (https://www.prime.xyz)</w:t>
       </w:r>
     </w:p>
@@ -1900,7 +1913,7 @@
         <w:spacing w:after="100"/>
       </w:pPr>
       <w:r>
-        <w:t xml:space="preserve">TypeScript, Blockchain, Cryptocurrencies, Solidity, Ethereum, Web3, dApps, End-to-End Product Ownership, Technical Leadership, ethers.js, DAOs, DAO Governance Systems, DeFi, Wallets, ReFi, SPA, IPFS, Subgraph, Liquidity Bootstrapping Pools, Technical Interviewing, Code Review, Smart Contract Security Review, web3.js, Balancer Liquidity Pools, Gnosis Safe, Defender, Ceramic, ENS, LitProtocol, Metamask, WalletConnect, Web3Modal, JavaScript, Node.js, Vite, HTML, CSS, SASS, Responsive, React, Aurelia, Webpack, Rollup, i18Next, GitHub</w:t>
+        <w:t xml:space="preserve">TypeScript, Blockchain, Cryptocurrencies, Solidity, Ethereum, Web3, dApps, End-to-End Product Ownership, Technical Leadership, ethers.js, DAOs, DAO Governance Systems, DeFi, Wallets, ReFi, SPA, IPFS, Subgraph, Liquidity Bootstrapping Pools, Mentoring, Technical Interviewing, Code Review, Smart Contract Security Review, web3.js, Balancer Liquidity Pools, Gnosis Safe, Defender, Ceramic, ENS, LitProtocol, Metamask, WalletConnect, Web3Modal, JavaScript, Node.js, Vite, HTML, CSS, SASS, Responsive, React, Aurelia, Webpack, Rollup, i18Next, GitHub</w:t>
       </w:r>
     </w:p>
     <w:p>

</xml_diff>

<commit_message>
Reorder and extend Areas of Expertise
Sixteen items, led by applied AI and AI-native products, with
end-to-end product engineering and technical leadership and mentoring
added. The two longest names are short enough not to wrap in the
desktop two-column layout. Also replace a stale skills count in a
JSON-LD plugin comment with wording that won't go stale. Regenerated
resume.txt, resume.docx, the JSON-LD and the prerender snapshot.

Co-Authored-By: Claude Opus 5.5 <noreply@anthropic.com>
</commit_message>
<xml_diff>
--- a/src/static/resume.docx
+++ b/src/static/resume.docx
@@ -125,6 +125,14 @@
         <w:spacing w:after="0"/>
       </w:pPr>
       <w:r>
+        <w:t xml:space="preserve">Applied AI and AI-Native Products</w:t>
+      </w:r>
+    </w:p>
+    <w:p>
+      <w:pPr>
+        <w:spacing w:after="0"/>
+      </w:pPr>
+      <w:r>
         <w:t xml:space="preserve">LLM Pipeline Architecture</w:t>
       </w:r>
     </w:p>
@@ -149,7 +157,31 @@
         <w:spacing w:after="0"/>
       </w:pPr>
       <w:r>
-        <w:t xml:space="preserve">AI-Assisted Software Development</w:t>
+        <w:t xml:space="preserve">AI-Assisted and Agentic Development</w:t>
+      </w:r>
+    </w:p>
+    <w:p>
+      <w:pPr>
+        <w:spacing w:after="0"/>
+      </w:pPr>
+      <w:r>
+        <w:t xml:space="preserve">End-to-End Product Engineering</w:t>
+      </w:r>
+    </w:p>
+    <w:p>
+      <w:pPr>
+        <w:spacing w:after="0"/>
+      </w:pPr>
+      <w:r>
+        <w:t xml:space="preserve">Software Architecture</w:t>
+      </w:r>
+    </w:p>
+    <w:p>
+      <w:pPr>
+        <w:spacing w:after="0"/>
+      </w:pPr>
+      <w:r>
+        <w:t xml:space="preserve">Technical Leadership and Mentoring</w:t>
       </w:r>
     </w:p>
     <w:p>
@@ -189,47 +221,31 @@
         <w:spacing w:after="0"/>
       </w:pPr>
       <w:r>
+        <w:t xml:space="preserve">Full-Stack Web Application Development</w:t>
+      </w:r>
+    </w:p>
+    <w:p>
+      <w:pPr>
+        <w:spacing w:after="0"/>
+      </w:pPr>
+      <w:r>
+        <w:t xml:space="preserve">Enterprise-Scale Web Applications</w:t>
+      </w:r>
+    </w:p>
+    <w:p>
+      <w:pPr>
+        <w:spacing w:after="0"/>
+      </w:pPr>
+      <w:r>
+        <w:t xml:space="preserve">Service-Oriented Architecture</w:t>
+      </w:r>
+    </w:p>
+    <w:p>
+      <w:pPr>
+        <w:spacing w:after="0"/>
+      </w:pPr>
+      <w:r>
         <w:t xml:space="preserve">Distributed and Offshore Team Leadership</w:t>
-      </w:r>
-    </w:p>
-    <w:p>
-      <w:pPr>
-        <w:spacing w:after="0"/>
-      </w:pPr>
-      <w:r>
-        <w:t xml:space="preserve">Enterprise-Scale Web Applications</w:t>
-      </w:r>
-    </w:p>
-    <w:p>
-      <w:pPr>
-        <w:spacing w:after="0"/>
-      </w:pPr>
-      <w:r>
-        <w:t xml:space="preserve">Service-Oriented Architecture</w:t>
-      </w:r>
-    </w:p>
-    <w:p>
-      <w:pPr>
-        <w:spacing w:after="0"/>
-      </w:pPr>
-      <w:r>
-        <w:t xml:space="preserve">Full-Stack Web Application Development</w:t>
-      </w:r>
-    </w:p>
-    <w:p>
-      <w:pPr>
-        <w:spacing w:after="0"/>
-      </w:pPr>
-      <w:r>
-        <w:t xml:space="preserve">Software Architecture</w:t>
-      </w:r>
-    </w:p>
-    <w:p>
-      <w:pPr>
-        <w:spacing w:after="0"/>
-      </w:pPr>
-      <w:r>
-        <w:t xml:space="preserve">Technical Leadership</w:t>
       </w:r>
     </w:p>
     <w:p>

</xml_diff>

<commit_message>
Consolidate Areas of Expertise into twelve column-first subjects
Twelve subject names without "Architecture"/"Development" suffixes,
each short enough not to wrap at any desktop width. The section now
fills its two columns top to bottom with CSS multi-column, so the list
reads down the left column then the right, and a wrapped item no
longer leaves a gap beside it. Also reword the "looking for" paragraph
(summary8) from "individual-contributor" to "hands-on technical".
Regenerated resume.txt, resume.docx, the JSON-LD and the prerender
snapshot.

Co-Authored-By: Claude Opus 5.5 <noreply@anthropic.com>
</commit_message>
<xml_diff>
--- a/src/static/resume.docx
+++ b/src/static/resume.docx
@@ -108,7 +108,7 @@
         <w:spacing w:after="100"/>
       </w:pPr>
       <w:r>
-        <w:t xml:space="preserve">I'm looking for a senior individual-contributor role in applied or forward-deployed AI, architecture, or staff-level engineering, where I can own a problem end to end, whether at an established company bringing AI into its products or at an AI-native one. I work remotely from Costa Rica, which overlaps well with US business hours, and am happy to travel as needed.</w:t>
+        <w:t xml:space="preserve">I'm looking for a senior, hands-on technical role in applied or forward-deployed AI, architecture, or staff-level engineering, where I can own a problem end to end, whether at an established company bringing AI into its products or at an AI-native one. I work remotely from Costa Rica, which overlaps well with US business hours, and am happy to travel as needed.</w:t>
       </w:r>
     </w:p>
     <w:p>
@@ -125,15 +125,55 @@
         <w:spacing w:after="0"/>
       </w:pPr>
       <w:r>
-        <w:t xml:space="preserve">Applied AI and AI-Native Products</w:t>
-      </w:r>
-    </w:p>
-    <w:p>
-      <w:pPr>
-        <w:spacing w:after="0"/>
-      </w:pPr>
-      <w:r>
-        <w:t xml:space="preserve">LLM Pipeline Architecture</w:t>
+        <w:t xml:space="preserve">Applied AI and LLM Applications</w:t>
+      </w:r>
+    </w:p>
+    <w:p>
+      <w:pPr>
+        <w:spacing w:after="0"/>
+      </w:pPr>
+      <w:r>
+        <w:t xml:space="preserve">AI-Assisted and Agentic Engineering</w:t>
+      </w:r>
+    </w:p>
+    <w:p>
+      <w:pPr>
+        <w:spacing w:after="0"/>
+      </w:pPr>
+      <w:r>
+        <w:t xml:space="preserve">Blockchain dApps and Smart Contracts</w:t>
+      </w:r>
+    </w:p>
+    <w:p>
+      <w:pPr>
+        <w:spacing w:after="0"/>
+      </w:pPr>
+      <w:r>
+        <w:t xml:space="preserve">DAO Governance Systems</w:t>
+      </w:r>
+    </w:p>
+    <w:p>
+      <w:pPr>
+        <w:spacing w:after="0"/>
+      </w:pPr>
+      <w:r>
+        <w:t xml:space="preserve">End-to-End Product Engineering</w:t>
+      </w:r>
+    </w:p>
+    <w:p>
+      <w:pPr>
+        <w:spacing w:after="0"/>
+      </w:pPr>
+      <w:r>
+        <w:t xml:space="preserve">Technical Leadership and Mentoring</w:t>
+      </w:r>
+    </w:p>
+    <w:p>
+      <w:pPr>
+        <w:spacing w:after="0"/>
+      </w:pPr>
+      <w:r>
+        <w:t xml:space="preserve">Human-in-the-Loop Systems</w:t>
       </w:r>
     </w:p>
     <w:p>
@@ -149,63 +189,7 @@
         <w:spacing w:after="0"/>
       </w:pPr>
       <w:r>
-        <w:t xml:space="preserve">Human-in-the-Loop System Design</w:t>
-      </w:r>
-    </w:p>
-    <w:p>
-      <w:pPr>
-        <w:spacing w:after="0"/>
-      </w:pPr>
-      <w:r>
-        <w:t xml:space="preserve">AI-Assisted and Agentic Development</w:t>
-      </w:r>
-    </w:p>
-    <w:p>
-      <w:pPr>
-        <w:spacing w:after="0"/>
-      </w:pPr>
-      <w:r>
-        <w:t xml:space="preserve">End-to-End Product Engineering</w:t>
-      </w:r>
-    </w:p>
-    <w:p>
-      <w:pPr>
-        <w:spacing w:after="0"/>
-      </w:pPr>
-      <w:r>
-        <w:t xml:space="preserve">Software Architecture</w:t>
-      </w:r>
-    </w:p>
-    <w:p>
-      <w:pPr>
-        <w:spacing w:after="0"/>
-      </w:pPr>
-      <w:r>
-        <w:t xml:space="preserve">Technical Leadership and Mentoring</w:t>
-      </w:r>
-    </w:p>
-    <w:p>
-      <w:pPr>
-        <w:spacing w:after="0"/>
-      </w:pPr>
-      <w:r>
-        <w:t xml:space="preserve">Blockchain and Web3 Architecture</w:t>
-      </w:r>
-    </w:p>
-    <w:p>
-      <w:pPr>
-        <w:spacing w:after="0"/>
-      </w:pPr>
-      <w:r>
-        <w:t xml:space="preserve">Smart Contract and dApp Development</w:t>
-      </w:r>
-    </w:p>
-    <w:p>
-      <w:pPr>
-        <w:spacing w:after="0"/>
-      </w:pPr>
-      <w:r>
-        <w:t xml:space="preserve">DAO Governance Systems</w:t>
+        <w:t xml:space="preserve">Enterprise APIs and Systems Integration</w:t>
       </w:r>
     </w:p>
     <w:p>
@@ -221,31 +205,15 @@
         <w:spacing w:after="0"/>
       </w:pPr>
       <w:r>
-        <w:t xml:space="preserve">Full-Stack Web Application Development</w:t>
-      </w:r>
-    </w:p>
-    <w:p>
-      <w:pPr>
-        <w:spacing w:after="0"/>
-      </w:pPr>
-      <w:r>
-        <w:t xml:space="preserve">Enterprise-Scale Web Applications</w:t>
-      </w:r>
-    </w:p>
-    <w:p>
-      <w:pPr>
-        <w:spacing w:after="0"/>
-      </w:pPr>
-      <w:r>
-        <w:t xml:space="preserve">Service-Oriented Architecture</w:t>
-      </w:r>
-    </w:p>
-    <w:p>
-      <w:pPr>
-        <w:spacing w:after="0"/>
-      </w:pPr>
-      <w:r>
-        <w:t xml:space="preserve">Distributed and Offshore Team Leadership</w:t>
+        <w:t xml:space="preserve">Software Project Management</w:t>
+      </w:r>
+    </w:p>
+    <w:p>
+      <w:pPr>
+        <w:spacing w:after="0"/>
+      </w:pPr>
+      <w:r>
+        <w:t xml:space="preserve">Decision and Risk Analysis</w:t>
       </w:r>
     </w:p>
     <w:p>

</xml_diff>

<commit_message>
Stop implying a firm uses Human Lens
The accomplishment now says the app was "designed to produce" findings
a DEI consultancy could rely on, rather than that it produces them, and
the work summary says the firm's practice was "published" rather than
"manual", making clear the methodology came from public material.
Regenerated resume.txt, resume.docx, the JSON-LD and the prerender
snapshot.

Co-Authored-By: Claude Opus 5.5 <noreply@anthropic.com>
</commit_message>
<xml_diff>
--- a/src/static/resume.docx
+++ b/src/static/resume.docx
@@ -235,7 +235,7 @@
         <w:spacing w:after="60"/>
       </w:pPr>
       <w:r>
-        <w:t xml:space="preserve">Working with subjective human voices and non-deterministic AI interpretations, I led the design and development of Human Lens, an AI-native qualitative analysis application that produces findings solid enough for a DEI consultancy to advise its clients with confidence.</w:t>
+        <w:t xml:space="preserve">Working with subjective human voices and non-deterministic AI interpretations, I led the design and development of Human Lens, an AI-native qualitative analysis application designed to produce findings solid enough for a DEI consultancy to advise its clients with confidence.</w:t>
       </w:r>
     </w:p>
     <w:p>
@@ -1030,7 +1030,7 @@
         <w:spacing w:after="100"/>
       </w:pPr>
       <w:r>
-        <w:t xml:space="preserve">Translated a firm's manual qualitative analysis practice into a full-stack web application wrapping a bounded, testable LLM pipeline: staged contracts between components, empirical calibration to reduce output variance, and a client-safe boundary enforced from the pipeline through to the human-review interface. Owned design, architecture, implementation, and QA end to end. Modeled on the practice of an existing DEI consultancy.</w:t>
+        <w:t xml:space="preserve">Translated a firm's published qualitative analysis practice into a full-stack web application wrapping a bounded, testable LLM pipeline: staged contracts between components, empirical calibration to reduce output variance, and a client-safe boundary enforced from the pipeline through to the human-review interface. Owned design, architecture, implementation, and QA end to end. Modeled on the practice of an existing DEI consultancy.</w:t>
       </w:r>
     </w:p>
     <w:p>

</xml_diff>

<commit_message>
Merge the AI-assisted and agentic skills; add two practice skills
"Agent/AI-assisted Development" replaces both AI-Assisted Development
and Agentic Software Development, which is kept as its alias, on Human
Lens and both Butterfly entries. New catalog skills Software Project
Management and Decision and Risk Analysis back the matching Areas of
Expertise items. Regenerated resume.txt, resume.docx, the JSON-LD and
the prerender snapshot; this is the content already deployed.

Co-Authored-By: Claude Opus 5.5 <noreply@anthropic.com>
</commit_message>
<xml_diff>
--- a/src/static/resume.docx
+++ b/src/static/resume.docx
@@ -644,7 +644,7 @@
         <w:spacing w:after="100"/>
       </w:pPr>
       <w:r>
-        <w:t xml:space="preserve">LLM Pipeline Architecture, LLM Evaluation, Applied AI, Human-in-the-Loop Design, Prompt Engineering, Agentic Software Development, AI-Assisted Development, De-identification, Claude Code for VS Code, LLM Orchestration, AI Product Development, Non-Deterministic System Testing, Synthetic Data Generation, Responsible AI, LLM APIs, Claude.ai (LLM), GitHub Copilot, ChatGPT (LLM)</w:t>
+        <w:t xml:space="preserve">LLM Pipeline Architecture, LLM Evaluation, Applied AI, Human-in-the-Loop Design, Prompt Engineering, Agent/AI-assisted Development, De-identification, Claude Code for VS Code, LLM Orchestration, AI Product Development, Non-Deterministic System Testing, Synthetic Data Generation, Responsible AI, LLM APIs, Claude.ai (LLM), GitHub Copilot, ChatGPT (LLM)</w:t>
       </w:r>
     </w:p>
     <w:p>
@@ -661,7 +661,7 @@
         <w:spacing w:after="100"/>
       </w:pPr>
       <w:r>
-        <w:t xml:space="preserve">End-to-End Product Ownership, Technical Leadership, Team Leadership, Mentoring, Technical Interviewing, Requirements Analysis, Domain Modeling, Code Review, Prototyping, Client Integration</w:t>
+        <w:t xml:space="preserve">End-to-End Product Ownership, Technical Leadership, Software Project Management, Team Leadership, Mentoring, Technical Interviewing, Requirements Analysis, Domain Modeling, Code Review, Prototyping, Client Integration</w:t>
       </w:r>
     </w:p>
     <w:p>
@@ -1168,7 +1168,7 @@
         <w:spacing w:after="100"/>
       </w:pPr>
       <w:r>
-        <w:t xml:space="preserve">LLM Pipeline Architecture, LLM Evaluation, Applied AI, TypeScript, Human-in-the-Loop Design, Prompt Engineering, Agentic Software Development, De-identification, End-to-End Product Ownership, Aurelia 2, Claude Code for VS Code, LLM Orchestration, AI Product Development, Non-Deterministic System Testing, Synthetic Data Generation, Responsible AI, LLM APIs, Claude.ai (LLM), GitHub Copilot, ChatGPT (LLM), Requirements Analysis, Domain Modeling, Fastify, TailWind CSS, Axios, Node.js, Awilix, Vite, HTML, Visual Studio Code, Vitest, NPM</w:t>
+        <w:t xml:space="preserve">LLM Pipeline Architecture, LLM Evaluation, Applied AI, TypeScript, Human-in-the-Loop Design, Prompt Engineering, Agent/AI-assisted Development, De-identification, End-to-End Product Ownership, Aurelia 2, Claude Code for VS Code, LLM Orchestration, AI Product Development, Non-Deterministic System Testing, Synthetic Data Generation, Responsible AI, LLM APIs, Claude.ai (LLM), GitHub Copilot, ChatGPT (LLM), Requirements Analysis, Domain Modeling, Fastify, TailWind CSS, Axios, Node.js, Awilix, Vite, HTML, Visual Studio Code, Vitest, NPM</w:t>
       </w:r>
     </w:p>
     <w:p>
@@ -1308,7 +1308,7 @@
         <w:spacing w:after="100"/>
       </w:pPr>
       <w:r>
-        <w:t xml:space="preserve">TypeScript, Blockchain, Cryptocurrencies, AI-Assisted Development, End-to-End Product Ownership, Aurelia 2, DeFi, MVVM, GitHub Copilot, TailWind CSS, Axios, Vite, FluentUI Web Components, GitHub</w:t>
+        <w:t xml:space="preserve">TypeScript, Blockchain, Cryptocurrencies, Agent/AI-assisted Development, End-to-End Product Ownership, Aurelia 2, DeFi, MVVM, GitHub Copilot, TailWind CSS, Axios, Vite, FluentUI Web Components, GitHub</w:t>
       </w:r>
     </w:p>
     <w:p>
@@ -1487,7 +1487,7 @@
         <w:spacing w:after="100"/>
       </w:pPr>
       <w:r>
-        <w:t xml:space="preserve">TypeScript, Blockchain, Cryptocurrencies, AI-Assisted Development, End-to-End Product Ownership, DeFi, GitHub Copilot, API Design, OpenAPI, Exchange API Integration, Fastify, Axios, Node.js, TSyringe, Vite, GitHub</w:t>
+        <w:t xml:space="preserve">TypeScript, Blockchain, Cryptocurrencies, Agent/AI-assisted Development, End-to-End Product Ownership, DeFi, GitHub Copilot, API Design, OpenAPI, Exchange API Integration, Fastify, Axios, Node.js, TSyringe, Vite, GitHub</w:t>
       </w:r>
     </w:p>
     <w:p>

</xml_diff>

<commit_message>
New headline that breaks only between its phrases
The label becomes "Applied AI & Blockchain Software Engineer ·
End-to-End Product Engineer · Technical Leader and Mentor". The page
renders it one span per phrase, through a new split value converter,
so lines break only between phrases and never start with "·"; the
heading's text is still the label exactly. On phones the phrases stack
one per line, separators hidden, with a 1em hanging indent for a phrase
that wraps. Updated the metaTitle comment for the new label's length.
Regenerated resume.txt, resume.docx, the JSON-LD and the prerender
snapshot, which also brings in the Decision and Risk Analysis skill
that the previous commit's generated files lacked.

Co-Authored-By: Claude Opus 5.5 <noreply@anthropic.com>
</commit_message>
<xml_diff>
--- a/src/static/resume.docx
+++ b/src/static/resume.docx
@@ -16,7 +16,7 @@
         <w:spacing w:after="0"/>
       </w:pPr>
       <w:r>
-        <w:t xml:space="preserve">Applied AI Engineer &amp; Software Architect · LLM Systems, Full-Stack, Blockchain</w:t>
+        <w:t xml:space="preserve">Applied AI &amp; Blockchain Software Engineer · End-to-End Product Engineer · Technical Leader and Mentor</w:t>
       </w:r>
     </w:p>
     <w:p>
@@ -661,7 +661,7 @@
         <w:spacing w:after="100"/>
       </w:pPr>
       <w:r>
-        <w:t xml:space="preserve">End-to-End Product Ownership, Technical Leadership, Software Project Management, Team Leadership, Mentoring, Technical Interviewing, Requirements Analysis, Domain Modeling, Code Review, Prototyping, Client Integration</w:t>
+        <w:t xml:space="preserve">End-to-End Product Ownership, Technical Leadership, Decision and Risk Analysis, Software Project Management, Team Leadership, Mentoring, Technical Interviewing, Requirements Analysis, Domain Modeling, Code Review, Prototyping, Client Integration</w:t>
       </w:r>
     </w:p>
     <w:p>
@@ -967,7 +967,7 @@
         <w:spacing w:after="100"/>
       </w:pPr>
       <w:r>
-        <w:t xml:space="preserve">Agile Methodologies, Just Get It Done, Waterfall, TFS</w:t>
+        <w:t xml:space="preserve">Decision and Risk Analysis, Agile Methodologies, Just Get It Done, Waterfall, TFS</w:t>
       </w:r>
     </w:p>
     <w:p>

</xml_diff>

<commit_message>
Name the self-directed roles as independent projects
Human Lens and both Butterfly entries now carry the project in
company ("Independent Project (Human Lens)", "Independent Project
(Butterfly)") and a plain role in position; the Butterfly summaries
say "web app" for the dApp. Regenerated resume.txt, resume.docx, the
JSON-LD and the prerender snapshot from this resume.json.

Co-Authored-By: Claude Opus 5.5 <noreply@anthropic.com>
</commit_message>
<xml_diff>
--- a/src/static/resume.docx
+++ b/src/static/resume.docx
@@ -986,16 +986,16 @@
         <w:keepLines/>
       </w:pPr>
       <w:r>
-        <w:t xml:space="preserve">Applied AI Engineer &amp; Architect — Human Lens, AI-native analysis app</w:t>
-      </w:r>
-    </w:p>
-    <w:p>
-      <w:pPr>
-        <w:keepNext/>
-        <w:spacing w:after="0"/>
-      </w:pPr>
-      <w:r>
-        <w:t xml:space="preserve">Independent Software Developer | 05/2026 - Present</w:t>
+        <w:t xml:space="preserve">Applied AI Software Engineer &amp; Architect</w:t>
+      </w:r>
+    </w:p>
+    <w:p>
+      <w:pPr>
+        <w:keepNext/>
+        <w:spacing w:after="0"/>
+      </w:pPr>
+      <w:r>
+        <w:t xml:space="preserve">Independent Project (Human Lens) | 05/2026 - Present</w:t>
       </w:r>
     </w:p>
     <w:p>
@@ -1178,16 +1178,16 @@
         <w:keepLines/>
       </w:pPr>
       <w:r>
-        <w:t xml:space="preserve">Product Engineer &amp; Architect — Butterfly, crypto portfolio management dApp</w:t>
-      </w:r>
-    </w:p>
-    <w:p>
-      <w:pPr>
-        <w:keepNext/>
-        <w:spacing w:after="0"/>
-      </w:pPr>
-      <w:r>
-        <w:t xml:space="preserve">Independent Software Developer | 06/2025 - 09/2025</w:t>
+        <w:t xml:space="preserve">Applied Blockchain Software Architect and Engineer</w:t>
+      </w:r>
+    </w:p>
+    <w:p>
+      <w:pPr>
+        <w:keepNext/>
+        <w:spacing w:after="0"/>
+      </w:pPr>
+      <w:r>
+        <w:t xml:space="preserve">Independent Project (Butterfly) | 06/2025 - 09/2025</w:t>
       </w:r>
     </w:p>
     <w:p>
@@ -1222,7 +1222,7 @@
         <w:spacing w:after="100"/>
       </w:pPr>
       <w:r>
-        <w:t xml:space="preserve">Designed and built a cryptocurrency portfolio management dApp that executes scaled take-profit sales across multiple exchanges, owning design, architecture, implementation, and QA end to end. Supported by the Butterfly Crypto portfolio management service.</w:t>
+        <w:t xml:space="preserve">Designed and built a cryptocurrency portfolio management web app that executes scaled take-profit sales across multiple exchanges, owning design, architecture, implementation, and QA end to end. Supported by the Butterfly Crypto portfolio management service.</w:t>
       </w:r>
     </w:p>
     <w:p>
@@ -1318,16 +1318,16 @@
         <w:keepLines/>
       </w:pPr>
       <w:r>
-        <w:t xml:space="preserve">Product Engineer &amp; Architect — Butterfly, crypto portfolio management service</w:t>
-      </w:r>
-    </w:p>
-    <w:p>
-      <w:pPr>
-        <w:keepNext/>
-        <w:spacing w:after="0"/>
-      </w:pPr>
-      <w:r>
-        <w:t xml:space="preserve">Independent Software Developer | 06/2025 - 09/2025</w:t>
+        <w:t xml:space="preserve">Applied Blockchain Software Architect and Engineer</w:t>
+      </w:r>
+    </w:p>
+    <w:p>
+      <w:pPr>
+        <w:keepNext/>
+        <w:spacing w:after="0"/>
+      </w:pPr>
+      <w:r>
+        <w:t xml:space="preserve">Independent Project (Butterfly) | 06/2025 - 09/2025</w:t>
       </w:r>
     </w:p>
     <w:p>
@@ -1362,7 +1362,7 @@
         <w:spacing w:after="100"/>
       </w:pPr>
       <w:r>
-        <w:t xml:space="preserve">Designed and built a REST API service supporting secure cryptocurrency exchange operations across multiple exchanges, owning design, architecture, implementation, and QA end to end. Supports the Butterfly Crypto portfolio management dApp.</w:t>
+        <w:t xml:space="preserve">Designed and built a REST API service supporting secure cryptocurrency exchange operations across multiple exchanges, owning design, architecture, implementation, and QA end to end. Supports the Butterfly Crypto portfolio management web app.</w:t>
       </w:r>
     </w:p>
     <w:p>

</xml_diff>

<commit_message>
Lead the Butterfly titles with "Engineer", matching Human Lens
Both Butterfly entries become "Applied Blockchain Software Engineer &
Architect", in line with "Applied AI Software Engineer & Architect".
Regenerated resume.txt, resume.docx, the JSON-LD and the prerender
snapshot.

Co-Authored-By: Claude Opus 5.5 <noreply@anthropic.com>
</commit_message>
<xml_diff>
--- a/src/static/resume.docx
+++ b/src/static/resume.docx
@@ -1178,7 +1178,7 @@
         <w:keepLines/>
       </w:pPr>
       <w:r>
-        <w:t xml:space="preserve">Applied Blockchain Software Architect and Engineer</w:t>
+        <w:t xml:space="preserve">Applied Blockchain Software Engineer &amp; Architect</w:t>
       </w:r>
     </w:p>
     <w:p>
@@ -1318,7 +1318,7 @@
         <w:keepLines/>
       </w:pPr>
       <w:r>
-        <w:t xml:space="preserve">Applied Blockchain Software Architect and Engineer</w:t>
+        <w:t xml:space="preserve">Applied Blockchain Software Engineer &amp; Architect</w:t>
       </w:r>
     </w:p>
     <w:p>

</xml_diff>

<commit_message>
Rewrite the introduction, bio and meta description around the new lead
summary1, 2, 7 and 8 now run: what I do (applied AI and blockchain
software engineer who builds products end to end), how I work, track
record, and what I'm looking for. bio and metaDescription drop
"software engineer and architect" for the same lead. Updated the bio
comment's quote of the page's opening. Regenerated resume.txt,
resume.docx, the JSON-LD and the prerender snapshot.

Co-Authored-By: Claude Opus 5.5 <noreply@anthropic.com>
</commit_message>
<xml_diff>
--- a/src/static/resume.docx
+++ b/src/static/resume.docx
@@ -84,31 +84,31 @@
         <w:spacing w:after="100"/>
       </w:pPr>
       <w:r>
-        <w:t xml:space="preserve">I am a software engineer and architect who takes a project across all its dimensions: the people it serves, the context it has to work in, its design and architecture, the build, and the proof that it works. Startups have repeatedly brought me in as their first engineer, and I have been building software professionally since 1985, across web applications, blockchain and Web3 platforms, and AI-native applications.</w:t>
-      </w:r>
-    </w:p>
-    <w:p>
-      <w:pPr>
-        <w:spacing w:after="100"/>
-      </w:pPr>
-      <w:r>
-        <w:t xml:space="preserve">I have worn multiple hats in important roles across many kinds of organizations, from Microsoft to garage startups — enough to recognize most problems before they become expensive. I have managed teams, but I do my best work as a hands-on technical lead, including mentoring the developers around me.</w:t>
-      </w:r>
-    </w:p>
-    <w:p>
-      <w:pPr>
-        <w:spacing w:after="100"/>
-      </w:pPr>
-      <w:r>
-        <w:t xml:space="preserve">My recent work is applied AI: AI-native applications in which language models do the core work, built to be reliable on top of subjective inputs and non-deterministic models. That means evaluation that measures what a model invents as well as what it misses, and a person approving anything that reaches a client.</w:t>
-      </w:r>
-    </w:p>
-    <w:p>
-      <w:pPr>
-        <w:spacing w:after="100"/>
-      </w:pPr>
-      <w:r>
-        <w:t xml:space="preserve">I'm looking for a senior, hands-on technical role in applied or forward-deployed AI, architecture, or staff-level engineering, where I can own a problem end to end, whether at an established company bringing AI into its products or at an AI-native one. I work remotely from Costa Rica, which overlaps well with US business hours, and am happy to travel as needed.</w:t>
+        <w:t xml:space="preserve">I am an applied AI and blockchain software engineer who builds products end to end. My recent work is AI-native applications in which language models do the core work, built to be reliable despite non-deterministic models.</w:t>
+      </w:r>
+    </w:p>
+    <w:p>
+      <w:pPr>
+        <w:spacing w:after="100"/>
+      </w:pPr>
+      <w:r>
+        <w:t xml:space="preserve">I take a project across all its dimensions: the people it serves, the context it has to work in, its design and architecture, the build, and the proof that it works. I have worn enough hats, from Microsoft to garage startups, to recognize most problems before they become expensive. I have managed teams, but I do my best work as a hands-on technical lead and mentor.</w:t>
+      </w:r>
+    </w:p>
+    <w:p>
+      <w:pPr>
+        <w:spacing w:after="100"/>
+      </w:pPr>
+      <w:r>
+        <w:t xml:space="preserve">I have adopted major technologies while they were still new: rendering 3D graphics on early PCs, creating some of the first multimedia CD products, writing early applications for the internet and the World Wide Web, developing dApps and DAOs on the blockchain, and now building AI-native applications. Several startups brought me in as their first software or front-end engineer, and I have been building software professionally since 1985.</w:t>
+      </w:r>
+    </w:p>
+    <w:p>
+      <w:pPr>
+        <w:spacing w:after="100"/>
+      </w:pPr>
+      <w:r>
+        <w:t xml:space="preserve">I'm looking for a senior, hands-on technical role in applied or forward-deployed AI, architecture, or staff-level engineering, where I can continue learning and doing things that matter. I work remotely from Costa Rica, which overlaps well with US business hours, and am happy to travel.</w:t>
       </w:r>
     </w:p>
     <w:p>

</xml_diff>

<commit_message>
Add an LLMs skill; retitle the Curve Labs, DAOstack and Revionics roles
New "Large Language Models (LLMs)" skill (AI, priority 0.116, alias
"LLMs"), added to Human Lens. Curve Labs becomes "Senior Web3
Application Developer, Software Development Team Lead", DAOstack
"Senior Web3 Application Developer", and Revionics "Senior Web
Application Developer". Also gitignore the .claude/launch.json the
desktop app's preview pane writes. Regenerated resume.txt,
resume.docx, the JSON-LD and the prerender snapshot from this
resume.json.

Co-Authored-By: Claude Opus 5.5 <noreply@anthropic.com>
</commit_message>
<xml_diff>
--- a/src/static/resume.docx
+++ b/src/static/resume.docx
@@ -644,7 +644,7 @@
         <w:spacing w:after="100"/>
       </w:pPr>
       <w:r>
-        <w:t xml:space="preserve">LLM Pipeline Architecture, LLM Evaluation, Applied AI, Human-in-the-Loop Design, Prompt Engineering, Agent/AI-assisted Development, De-identification, Claude Code for VS Code, LLM Orchestration, AI Product Development, Non-Deterministic System Testing, Synthetic Data Generation, Responsible AI, LLM APIs, Claude.ai (LLM), GitHub Copilot, ChatGPT (LLM)</w:t>
+        <w:t xml:space="preserve">LLM Pipeline Architecture, LLM Evaluation, Applied AI, Large Language Models (LLMs), Human-in-the-Loop Design, Prompt Engineering, Agent/AI-assisted Development, De-identification, Claude Code for VS Code, LLM Orchestration, AI Product Development, Non-Deterministic System Testing, Synthetic Data Generation, Responsible AI, LLM APIs, Claude.ai (LLM), GitHub Copilot, ChatGPT (LLM)</w:t>
       </w:r>
     </w:p>
     <w:p>
@@ -1168,7 +1168,7 @@
         <w:spacing w:after="100"/>
       </w:pPr>
       <w:r>
-        <w:t xml:space="preserve">LLM Pipeline Architecture, LLM Evaluation, Applied AI, TypeScript, Human-in-the-Loop Design, Prompt Engineering, Agent/AI-assisted Development, De-identification, End-to-End Product Ownership, Aurelia 2, Claude Code for VS Code, LLM Orchestration, AI Product Development, Non-Deterministic System Testing, Synthetic Data Generation, Responsible AI, LLM APIs, Claude.ai (LLM), GitHub Copilot, ChatGPT (LLM), Requirements Analysis, Domain Modeling, Fastify, TailWind CSS, Axios, Node.js, Awilix, Vite, HTML, Visual Studio Code, Vitest, NPM</w:t>
+        <w:t xml:space="preserve">LLM Pipeline Architecture, LLM Evaluation, Applied AI, Large Language Models (LLMs), TypeScript, Human-in-the-Loop Design, Prompt Engineering, Agent/AI-assisted Development, De-identification, End-to-End Product Ownership, Aurelia 2, Claude Code for VS Code, LLM Orchestration, AI Product Development, Non-Deterministic System Testing, Synthetic Data Generation, Responsible AI, LLM APIs, Claude.ai (LLM), GitHub Copilot, ChatGPT (LLM), Requirements Analysis, Domain Modeling, Fastify, TailWind CSS, Axios, Node.js, Awilix, Vite, HTML, Visual Studio Code, Vitest, NPM</w:t>
       </w:r>
     </w:p>
     <w:p>
@@ -1650,7 +1650,7 @@
         <w:keepLines/>
       </w:pPr>
       <w:r>
-        <w:t xml:space="preserve">Development Team Lead and Lead Developer</w:t>
+        <w:t xml:space="preserve">Senior Web3 Application Developer, Software Development Team Lead</w:t>
       </w:r>
     </w:p>
     <w:p>
@@ -1907,7 +1907,7 @@
         <w:keepLines/>
       </w:pPr>
       <w:r>
-        <w:t xml:space="preserve">Senior Lead Developer</w:t>
+        <w:t xml:space="preserve">Senior Web3 Application Developer</w:t>
       </w:r>
     </w:p>
     <w:p>
@@ -2846,7 +2846,7 @@
         <w:keepLines/>
       </w:pPr>
       <w:r>
-        <w:t xml:space="preserve">Senior Web Developer</w:t>
+        <w:t xml:space="preserve">Senior Web Application Developer</w:t>
       </w:r>
     </w:p>
     <w:p>

</xml_diff>

<commit_message>
Reorder skills within their categories; rename dApps and DAOs
Reprioritise 48 skills, mostly in AI, Blockchain and Engineering
Practice & Leadership, and rename "dApps" to "dApp Development" and
"DAOs" to "DAO Development" along with the work entries that list
them. Generated files rebuilt from this resume.json.

Co-Authored-By: Claude Opus 5.5 <noreply@anthropic.com>
</commit_message>
<xml_diff>
--- a/src/static/resume.docx
+++ b/src/static/resume.docx
@@ -644,7 +644,7 @@
         <w:spacing w:after="100"/>
       </w:pPr>
       <w:r>
-        <w:t xml:space="preserve">LLM Pipeline Architecture, LLM Evaluation, Applied AI, Large Language Models (LLMs), Human-in-the-Loop Design, Prompt Engineering, Agent/AI-assisted Development, De-identification, Claude Code for VS Code, LLM Orchestration, AI Product Development, Non-Deterministic System Testing, Synthetic Data Generation, Responsible AI, LLM APIs, Claude.ai (LLM), GitHub Copilot, ChatGPT (LLM)</w:t>
+        <w:t xml:space="preserve">Applied AI, Agent/AI-assisted Development, AI Product Development, Large Language Models (LLMs), LLM Pipeline Architecture, LLM Evaluation, LLM Orchestration, Non-Deterministic System Testing, Human-in-the-Loop Design, Prompt Engineering, De-identification, Responsible AI, Synthetic Data Generation, Claude Code for VS Code, Claude.ai (LLM), ChatGPT (LLM), GitHub Copilot, LLM APIs</w:t>
       </w:r>
     </w:p>
     <w:p>
@@ -661,7 +661,7 @@
         <w:spacing w:after="100"/>
       </w:pPr>
       <w:r>
-        <w:t xml:space="preserve">End-to-End Product Ownership, Technical Leadership, Decision and Risk Analysis, Software Project Management, Team Leadership, Mentoring, Technical Interviewing, Requirements Analysis, Domain Modeling, Code Review, Prototyping, Client Integration</w:t>
+        <w:t xml:space="preserve">End-to-End Product Ownership, Technical Leadership, Team Leadership, Software Project Management, Decision and Risk Analysis, Mentoring, Domain Modeling, Technical Interviewing, Requirements Analysis, Code Review, Prototyping, Client Integration</w:t>
       </w:r>
     </w:p>
     <w:p>
@@ -678,7 +678,7 @@
         <w:spacing w:after="100"/>
       </w:pPr>
       <w:r>
-        <w:t xml:space="preserve">Blockchain, Cryptocurrencies, Solidity, Ethereum, Web3, dApps, ethers.js, DAOs, DAO Governance Systems, DeFi, Wallets, ReFi, IPFS, Subgraph, Liquidity Bootstrapping Pools, Smart Contract Security Review, Smart Contract Deployment, web3.js, Celo, Arbitrum, Balancer Liquidity Pools, Gnosis Safe, OpenZeppelin Defender, Ceramic, 3Box, ENS, Mento, LitProtocol, Metamask, WalletConnect, Web3Modal</w:t>
+        <w:t xml:space="preserve">Blockchain, Cryptocurrencies, dApp Development, DAO Development, DAO Governance Systems, Liquidity Bootstrapping Pools, Balancer Liquidity Pools, DeFi, ReFi, Web3, Ethereum, Solidity, Wallets, Gnosis Safe, Metamask, WalletConnect, Web3Modal, ethers.js, web3.js, IPFS, Subgraph, Smart Contract Security Review, Smart Contract Deployment, Celo, Arbitrum, OpenZeppelin Defender, Ceramic, 3Box, ENS, Mento, LitProtocol</w:t>
       </w:r>
     </w:p>
     <w:p>
@@ -695,7 +695,7 @@
         <w:spacing w:after="100"/>
       </w:pPr>
       <w:r>
-        <w:t xml:space="preserve">TypeScript, Web3, dApps, Aurelia 2, Web Components, Wallets, MVVM, SPA, API Design, SDK/Library Design, Systems Integration, OpenAPI, Exchange API Integration, Fastify, JavaScript, TailWind CSS, Axios, Node.js, Awilix, TSyringe, Vite, HTML, CSS, Custom (HTML) Elements, Shadow DOM, HTML Templates, Data Binding, Observables, Pub/Sub Pattern, RxJS, SASS, Responsive UIs, Service-Oriented Architecture (SOA), React, Aurelia, AngularJS, FluentUI Web Components, Webpack, Rollup, C#, Markdown, XML, D3.js, Highcharts, ASP.NET Core, MVC, WebApi, ASP.NET Identity, Razor, Ajax, jQuery, Bootstrap, RequireJS, C++, Java, KnockoutJS, DurandalJs, ASP.NET, Enterprise Scale Web Applications, Telerik, Bootstrap Material Design, XSLT, XML Schema Definition (XSD), JSPM, SystemJS, WCF, WWF, Microsoft Extensibility Framework (MEF), JDBC, JSP, Swing, CORBA, Flash SWF, Xerces</w:t>
+        <w:t xml:space="preserve">TypeScript, dApp Development, Web3, Wallets, Aurelia 2, AngularJS, React, SPA, Web Components, MVVM, API Design, SDK/Library Design, Systems Integration, OpenAPI, Exchange API Integration, Fastify, JavaScript, TailWind CSS, Axios, Node.js, Awilix, TSyringe, Vite, HTML, CSS, Custom (HTML) Elements, Shadow DOM, HTML Templates, Data Binding, Observables, Pub/Sub Pattern, RxJS, SASS, Responsive UIs, Service-Oriented Architecture (SOA), Aurelia, FluentUI Web Components, Webpack, Rollup, C#, Markdown, XML, D3.js, Highcharts, ASP.NET Core, MVC, WebApi, ASP.NET Identity, Razor, Ajax, jQuery, Bootstrap, RequireJS, C++, Java, KnockoutJS, DurandalJs, ASP.NET, Enterprise Scale Web Applications, Telerik, Bootstrap Material Design, XSLT, XML Schema Definition (XSD), JSPM, SystemJS, WCF, WWF, Microsoft Extensibility Framework (MEF), JDBC, JSP, Swing, CORBA, Flash SWF, Xerces</w:t>
       </w:r>
     </w:p>
     <w:p>
@@ -848,7 +848,7 @@
         <w:spacing w:after="100"/>
       </w:pPr>
       <w:r>
-        <w:t xml:space="preserve">De-identification, LitProtocol, crypto-js, DES, Encryption, SHA-2, .NET System.Security.Cryptography</w:t>
+        <w:t xml:space="preserve">De-identification, crypto-js, LitProtocol, DES, Encryption, SHA-2, .NET System.Security.Cryptography</w:t>
       </w:r>
     </w:p>
     <w:p>
@@ -1168,7 +1168,7 @@
         <w:spacing w:after="100"/>
       </w:pPr>
       <w:r>
-        <w:t xml:space="preserve">LLM Pipeline Architecture, LLM Evaluation, Applied AI, Large Language Models (LLMs), TypeScript, Human-in-the-Loop Design, Prompt Engineering, Agent/AI-assisted Development, De-identification, End-to-End Product Ownership, Aurelia 2, Claude Code for VS Code, LLM Orchestration, AI Product Development, Non-Deterministic System Testing, Synthetic Data Generation, Responsible AI, LLM APIs, Claude.ai (LLM), GitHub Copilot, ChatGPT (LLM), Requirements Analysis, Domain Modeling, Fastify, TailWind CSS, Axios, Node.js, Awilix, Vite, HTML, Visual Studio Code, Vitest, NPM</w:t>
+        <w:t xml:space="preserve">Applied AI, Agent/AI-assisted Development, End-to-End Product Ownership, TypeScript, AI Product Development, Large Language Models (LLMs), LLM Pipeline Architecture, LLM Evaluation, LLM Orchestration, Non-Deterministic System Testing, Human-in-the-Loop Design, Prompt Engineering, De-identification, Responsible AI, Synthetic Data Generation, Claude Code for VS Code, Claude.ai (LLM), ChatGPT (LLM), GitHub Copilot, Aurelia 2, Domain Modeling, LLM APIs, Requirements Analysis, Fastify, TailWind CSS, Axios, Node.js, Awilix, Vite, HTML, Visual Studio Code, Vitest, NPM</w:t>
       </w:r>
     </w:p>
     <w:p>
@@ -1308,7 +1308,7 @@
         <w:spacing w:after="100"/>
       </w:pPr>
       <w:r>
-        <w:t xml:space="preserve">TypeScript, Blockchain, Cryptocurrencies, Agent/AI-assisted Development, End-to-End Product Ownership, Aurelia 2, DeFi, MVVM, GitHub Copilot, TailWind CSS, Axios, Vite, FluentUI Web Components, GitHub</w:t>
+        <w:t xml:space="preserve">Agent/AI-assisted Development, Blockchain, End-to-End Product Ownership, TypeScript, GitHub Copilot, Cryptocurrencies, DeFi, Aurelia 2, MVVM, TailWind CSS, Axios, Vite, FluentUI Web Components, GitHub</w:t>
       </w:r>
     </w:p>
     <w:p>
@@ -1487,7 +1487,7 @@
         <w:spacing w:after="100"/>
       </w:pPr>
       <w:r>
-        <w:t xml:space="preserve">TypeScript, Blockchain, Cryptocurrencies, Agent/AI-assisted Development, End-to-End Product Ownership, DeFi, GitHub Copilot, API Design, OpenAPI, Exchange API Integration, Fastify, Axios, Node.js, TSyringe, Vite, GitHub</w:t>
+        <w:t xml:space="preserve">Agent/AI-assisted Development, Blockchain, End-to-End Product Ownership, TypeScript, GitHub Copilot, Cryptocurrencies, DeFi, API Design, OpenAPI, Exchange API Integration, Fastify, Axios, Node.js, TSyringe, Vite, GitHub</w:t>
       </w:r>
     </w:p>
     <w:p>
@@ -1640,7 +1640,7 @@
         <w:spacing w:after="100"/>
       </w:pPr>
       <w:r>
-        <w:t xml:space="preserve">TypeScript, Solidity, Ethereum, ethers.js, DeFi, ReFi, Celo, Balancer Liquidity Pools, Defender, Mento, JavaScript, GitHub</w:t>
+        <w:t xml:space="preserve">TypeScript, Balancer Liquidity Pools, DeFi, ReFi, Ethereum, Solidity, ethers.js, Celo, Defender, Mento, JavaScript, GitHub</w:t>
       </w:r>
     </w:p>
     <w:p>
@@ -1897,7 +1897,7 @@
         <w:spacing w:after="100"/>
       </w:pPr>
       <w:r>
-        <w:t xml:space="preserve">TypeScript, Blockchain, Cryptocurrencies, Solidity, Ethereum, Web3, dApps, End-to-End Product Ownership, Technical Leadership, ethers.js, DAOs, DAO Governance Systems, DeFi, Wallets, ReFi, SPA, IPFS, Subgraph, Liquidity Bootstrapping Pools, Mentoring, Technical Interviewing, Code Review, Smart Contract Security Review, web3.js, Balancer Liquidity Pools, Gnosis Safe, Defender, Ceramic, ENS, LitProtocol, Metamask, WalletConnect, Web3Modal, JavaScript, Node.js, Vite, HTML, CSS, SASS, Responsive, React, Aurelia, Webpack, Rollup, i18Next, GitHub</w:t>
+        <w:t xml:space="preserve">Blockchain, End-to-End Product Ownership, Technical Leadership, TypeScript, Mentoring, Cryptocurrencies, dApp Development, DAO Development, DAO Governance Systems, Liquidity Bootstrapping Pools, Balancer Liquidity Pools, DeFi, ReFi, Web3, Ethereum, Solidity, Wallets, Gnosis Safe, Metamask, WalletConnect, Web3Modal, ethers.js, web3.js, IPFS, Subgraph, React, SPA, Technical Interviewing, Code Review, Smart Contract Security Review, Defender, Ceramic, ENS, LitProtocol, JavaScript, Node.js, Vite, HTML, CSS, SASS, Responsive, Aurelia, Webpack, Rollup, i18Next, GitHub</w:t>
       </w:r>
     </w:p>
     <w:p>
@@ -2076,7 +2076,7 @@
         <w:spacing w:after="100"/>
       </w:pPr>
       <w:r>
-        <w:t xml:space="preserve">TypeScript, Blockchain, Solidity, Ethereum, Web3, dApps, End-to-End Product Ownership, DAOs, DAO Governance Systems, Wallets, SPA, Subgraph, Prototyping, Smart Contract Deployment, 3Box, SDK/Library Design, JavaScript, Node.js, HTML, CSS, SASS, Responsive, React, Aurelia, Webpack, jQuery, Bootstrap, Bootstrap Material Design, GitHub</w:t>
+        <w:t xml:space="preserve">Blockchain, End-to-End Product Ownership, TypeScript, dApp Development, DAO Development, DAO Governance Systems, Web3, Ethereum, Solidity, Wallets, Subgraph, React, SPA, Prototyping, Smart Contract Deployment, 3Box, SDK/Library Design, JavaScript, Node.js, HTML, CSS, SASS, Responsive, Aurelia, Webpack, jQuery, Bootstrap, Bootstrap Material Design, GitHub</w:t>
       </w:r>
     </w:p>
     <w:p>
@@ -2470,7 +2470,7 @@
         <w:spacing w:after="100"/>
       </w:pPr>
       <w:r>
-        <w:t xml:space="preserve">TypeScript, SPA, AngularJS, C#, WebApi, ASP.NET, SQL Server, T-SQL, Unity, Entity Framework, Azure, TFS</w:t>
+        <w:t xml:space="preserve">TypeScript, AngularJS, SPA, C#, WebApi, ASP.NET, SQL Server, T-SQL, Unity, Entity Framework, Azure, TFS</w:t>
       </w:r>
     </w:p>
     <w:p>
@@ -2836,7 +2836,7 @@
         <w:spacing w:after="100"/>
       </w:pPr>
       <w:r>
-        <w:t xml:space="preserve">SPA, JavaScript, HTML, CSS, Aurelia, Webpack, C#, ASP.NET Core, MVC, WebAPI, Identity, Ajax, jQuery, Bootstrap, RequireJS, KnockoutJS, SQL Server, T-SQL, MsTest, XUnit.NET, crypto-js, DES, Encryption, SHA, System.Security.Cryptography, entity framework</w:t>
+        <w:t xml:space="preserve">crypto-js, SPA, JavaScript, HTML, CSS, Aurelia, Webpack, C#, ASP.NET Core, MVC, WebAPI, Identity, Ajax, jQuery, Bootstrap, RequireJS, KnockoutJS, SQL Server, T-SQL, MsTest, XUnit.NET, DES, Encryption, SHA, System.Security.Cryptography, entity framework</w:t>
       </w:r>
     </w:p>
     <w:p>

</xml_diff>

<commit_message>
Add a Product Development skill; fold AI Product Development and Aurelia 2
Add "Product Development" and list it on the roles it describes. Merge
"AI Product Development" into "Applied AI", now "Applied AI
Development", and make "Aurelia 2" an alias of "Aurelia". Reprioritise
a handful of skills, and name the code among a project's dimensions in
summary2 and NeXT among the early platforms in summary7. Generated
files rebuilt from this resume.json.

Co-Authored-By: Claude Opus 5.5 <noreply@anthropic.com>
</commit_message>
<xml_diff>
--- a/src/static/resume.docx
+++ b/src/static/resume.docx
@@ -92,15 +92,15 @@
         <w:spacing w:after="100"/>
       </w:pPr>
       <w:r>
-        <w:t xml:space="preserve">I take a project across all its dimensions: the people it serves, the context it has to work in, its design and architecture, the build, and the proof that it works. I have worn enough hats, from Microsoft to garage startups, to recognize most problems before they become expensive. I have managed teams, but I do my best work as a hands-on technical lead and mentor.</w:t>
-      </w:r>
-    </w:p>
-    <w:p>
-      <w:pPr>
-        <w:spacing w:after="100"/>
-      </w:pPr>
-      <w:r>
-        <w:t xml:space="preserve">I have adopted major technologies while they were still new: rendering 3D graphics on early PCs, creating some of the first multimedia CD products, writing early applications for the internet and the World Wide Web, developing dApps and DAOs on the blockchain, and now building AI-native applications. Several startups brought me in as their first software or front-end engineer, and I have been building software professionally since 1985.</w:t>
+        <w:t xml:space="preserve">I take a project across all its dimensions: the people it serves, the context it has to work in, its design and architecture, the code, the build, and the proof that it all works. I have worn enough hats, from Microsoft to garage startups, to recognize most problems before they become expensive. I have managed teams, but I do my best work as a hands-on technical lead and mentor.</w:t>
+      </w:r>
+    </w:p>
+    <w:p>
+      <w:pPr>
+        <w:spacing w:after="100"/>
+      </w:pPr>
+      <w:r>
+        <w:t xml:space="preserve">I have adopted major technologies while they were still new: rendering 3D graphics on early PCs, creating some of the first multimedia CD products, writing early applications for the internet and the World Wide Web, developing and selling an app for the NeXT computer, developing dApps and DAOs on the blockchain, and now building AI-native applications. Several startups brought me in as their first software or front-end engineer, and I have been building software professionally since 1985.</w:t>
       </w:r>
     </w:p>
     <w:p>
@@ -644,7 +644,7 @@
         <w:spacing w:after="100"/>
       </w:pPr>
       <w:r>
-        <w:t xml:space="preserve">Applied AI, Agent/AI-assisted Development, AI Product Development, Large Language Models (LLMs), LLM Pipeline Architecture, LLM Evaluation, LLM Orchestration, Non-Deterministic System Testing, Human-in-the-Loop Design, Prompt Engineering, De-identification, Responsible AI, Synthetic Data Generation, Claude Code for VS Code, Claude.ai (LLM), ChatGPT (LLM), GitHub Copilot, LLM APIs</w:t>
+        <w:t xml:space="preserve">Applied AI Development, Agent/AI-assisted Development, Large Language Models (LLMs), LLM Pipeline Architecture, LLM Evaluation, LLM Orchestration, Non-Deterministic System Testing, Human-in-the-Loop Design, Prompt Engineering, De-identification, Responsible AI, Synthetic Data Generation, Claude Code for VS Code, Claude.ai (LLM), ChatGPT (LLM), GitHub Copilot, LLM APIs</w:t>
       </w:r>
     </w:p>
     <w:p>
@@ -661,7 +661,7 @@
         <w:spacing w:after="100"/>
       </w:pPr>
       <w:r>
-        <w:t xml:space="preserve">End-to-End Product Ownership, Technical Leadership, Team Leadership, Software Project Management, Decision and Risk Analysis, Mentoring, Domain Modeling, Technical Interviewing, Requirements Analysis, Code Review, Prototyping, Client Integration</w:t>
+        <w:t xml:space="preserve">End-to-End Product Ownership, Technical Leadership, Software Project Management, Team Leadership, Decision and Risk Analysis, Mentoring, Domain Modeling, Technical Interviewing, Requirements Analysis, Code Review, Prototyping, Client Integration</w:t>
       </w:r>
     </w:p>
     <w:p>
@@ -678,7 +678,7 @@
         <w:spacing w:after="100"/>
       </w:pPr>
       <w:r>
-        <w:t xml:space="preserve">Blockchain, Cryptocurrencies, dApp Development, DAO Development, DAO Governance Systems, Liquidity Bootstrapping Pools, Balancer Liquidity Pools, DeFi, ReFi, Web3, Ethereum, Solidity, Wallets, Gnosis Safe, Metamask, WalletConnect, Web3Modal, ethers.js, web3.js, IPFS, Subgraph, Smart Contract Security Review, Smart Contract Deployment, Celo, Arbitrum, OpenZeppelin Defender, Ceramic, 3Box, ENS, Mento, LitProtocol</w:t>
+        <w:t xml:space="preserve">dApp Development, DAO Development, Blockchain, Cryptocurrencies, DAO Governance Systems, Liquidity Bootstrapping Pools, Balancer Liquidity Pools, DeFi, ReFi, Web3, Ethereum, Solidity, Wallets, Gnosis Safe, Metamask, WalletConnect, Web3Modal, ethers.js, web3.js, IPFS, Subgraph, Smart Contract Security Review, Smart Contract Deployment, Celo, Arbitrum, OpenZeppelin Defender, Ceramic, 3Box, ENS, Mento, LitProtocol</w:t>
       </w:r>
     </w:p>
     <w:p>
@@ -695,7 +695,7 @@
         <w:spacing w:after="100"/>
       </w:pPr>
       <w:r>
-        <w:t xml:space="preserve">TypeScript, dApp Development, Web3, Wallets, Aurelia 2, AngularJS, React, SPA, Web Components, MVVM, API Design, SDK/Library Design, Systems Integration, OpenAPI, Exchange API Integration, Fastify, JavaScript, TailWind CSS, Axios, Node.js, Awilix, TSyringe, Vite, HTML, CSS, Custom (HTML) Elements, Shadow DOM, HTML Templates, Data Binding, Observables, Pub/Sub Pattern, RxJS, SASS, Responsive UIs, Service-Oriented Architecture (SOA), Aurelia, FluentUI Web Components, Webpack, Rollup, C#, Markdown, XML, D3.js, Highcharts, ASP.NET Core, MVC, WebApi, ASP.NET Identity, Razor, Ajax, jQuery, Bootstrap, RequireJS, C++, Java, KnockoutJS, DurandalJs, ASP.NET, Enterprise Scale Web Applications, Telerik, Bootstrap Material Design, XSLT, XML Schema Definition (XSD), JSPM, SystemJS, WCF, WWF, Microsoft Extensibility Framework (MEF), JDBC, JSP, Swing, CORBA, Flash SWF, Xerces</w:t>
+        <w:t xml:space="preserve">dApp Development, Product Development, TypeScript, Web3, Wallets, Aurelia, AngularJS, React, SPA, Web Components, MVVM, API Design, SDK/Library Design, Systems Integration, OpenAPI, Exchange API Integration, Fastify, JavaScript, TailWind CSS, Axios, Node.js, Awilix, TSyringe, Vite, HTML, CSS, Custom (HTML) Elements, Shadow DOM, HTML Templates, Data Binding, Observables, Pub/Sub Pattern, RxJS, SASS, Responsive UIs, Service-Oriented Architecture (SOA), FluentUI Web Components, Webpack, Rollup, C#, Markdown, XML, D3.js, Highcharts, ASP.NET Core, MVC, WebApi, ASP.NET Identity, Razor, Ajax, jQuery, Bootstrap, RequireJS, C++, Java, KnockoutJS, DurandalJs, ASP.NET, Enterprise Scale Web Applications, Telerik, Bootstrap Material Design, XSLT, XML Schema Definition (XSD), JSPM, SystemJS, WCF, WWF, Microsoft Extensibility Framework (MEF), JDBC, JSP, Swing, CORBA, Flash SWF, Xerces</w:t>
       </w:r>
     </w:p>
     <w:p>
@@ -780,7 +780,7 @@
         <w:spacing w:after="100"/>
       </w:pPr>
       <w:r>
-        <w:t xml:space="preserve">Aurelia 2, Node.js, Aurelia, .NET</w:t>
+        <w:t xml:space="preserve">Aurelia, Node.js, .NET</w:t>
       </w:r>
     </w:p>
     <w:p>
@@ -1168,7 +1168,7 @@
         <w:spacing w:after="100"/>
       </w:pPr>
       <w:r>
-        <w:t xml:space="preserve">Applied AI, Agent/AI-assisted Development, End-to-End Product Ownership, TypeScript, AI Product Development, Large Language Models (LLMs), LLM Pipeline Architecture, LLM Evaluation, LLM Orchestration, Non-Deterministic System Testing, Human-in-the-Loop Design, Prompt Engineering, De-identification, Responsible AI, Synthetic Data Generation, Claude Code for VS Code, Claude.ai (LLM), ChatGPT (LLM), GitHub Copilot, Aurelia 2, Domain Modeling, LLM APIs, Requirements Analysis, Fastify, TailWind CSS, Axios, Node.js, Awilix, Vite, HTML, Visual Studio Code, Vitest, NPM</w:t>
+        <w:t xml:space="preserve">Applied AI Development, End-to-End Product Ownership, Agent/AI-assisted Development, TypeScript, Large Language Models (LLMs), LLM Pipeline Architecture, LLM Evaluation, LLM Orchestration, Non-Deterministic System Testing, Human-in-the-Loop Design, Prompt Engineering, De-identification, Responsible AI, Synthetic Data Generation, Claude Code for VS Code, Claude.ai (LLM), ChatGPT (LLM), GitHub Copilot, Aurelia 2, Domain Modeling, LLM APIs, Requirements Analysis, Fastify, TailWind CSS, Axios, Node.js, Awilix, Vite, HTML, Visual Studio Code, Vitest, NPM</w:t>
       </w:r>
     </w:p>
     <w:p>
@@ -1308,7 +1308,7 @@
         <w:spacing w:after="100"/>
       </w:pPr>
       <w:r>
-        <w:t xml:space="preserve">Agent/AI-assisted Development, Blockchain, End-to-End Product Ownership, TypeScript, GitHub Copilot, Cryptocurrencies, DeFi, Aurelia 2, MVVM, TailWind CSS, Axios, Vite, FluentUI Web Components, GitHub</w:t>
+        <w:t xml:space="preserve">End-to-End Product Ownership, Agent/AI-assisted Development, TypeScript, GitHub Copilot, Blockchain, Cryptocurrencies, DeFi, Aurelia 2, MVVM, TailWind CSS, Axios, Vite, FluentUI Web Components, GitHub</w:t>
       </w:r>
     </w:p>
     <w:p>
@@ -1487,7 +1487,7 @@
         <w:spacing w:after="100"/>
       </w:pPr>
       <w:r>
-        <w:t xml:space="preserve">Agent/AI-assisted Development, Blockchain, End-to-End Product Ownership, TypeScript, GitHub Copilot, Cryptocurrencies, DeFi, API Design, OpenAPI, Exchange API Integration, Fastify, Axios, Node.js, TSyringe, Vite, GitHub</w:t>
+        <w:t xml:space="preserve">End-to-End Product Ownership, Agent/AI-assisted Development, TypeScript, GitHub Copilot, Blockchain, Cryptocurrencies, DeFi, API Design, OpenAPI, Exchange API Integration, Fastify, Axios, Node.js, TSyringe, Vite, GitHub</w:t>
       </w:r>
     </w:p>
     <w:p>
@@ -1640,7 +1640,7 @@
         <w:spacing w:after="100"/>
       </w:pPr>
       <w:r>
-        <w:t xml:space="preserve">TypeScript, Balancer Liquidity Pools, DeFi, ReFi, Ethereum, Solidity, ethers.js, Celo, Defender, Mento, JavaScript, GitHub</w:t>
+        <w:t xml:space="preserve">TypeScript, Balancer Liquidity Pools, DeFi, ReFi, Ethereum, Solidity, ethers.js, Aurelia, Celo, Defender, Mento, JavaScript, GitHub</w:t>
       </w:r>
     </w:p>
     <w:p>
@@ -1897,7 +1897,7 @@
         <w:spacing w:after="100"/>
       </w:pPr>
       <w:r>
-        <w:t xml:space="preserve">Blockchain, End-to-End Product Ownership, Technical Leadership, TypeScript, Mentoring, Cryptocurrencies, dApp Development, DAO Development, DAO Governance Systems, Liquidity Bootstrapping Pools, Balancer Liquidity Pools, DeFi, ReFi, Web3, Ethereum, Solidity, Wallets, Gnosis Safe, Metamask, WalletConnect, Web3Modal, ethers.js, web3.js, IPFS, Subgraph, React, SPA, Technical Interviewing, Code Review, Smart Contract Security Review, Defender, Ceramic, ENS, LitProtocol, JavaScript, Node.js, Vite, HTML, CSS, SASS, Responsive, Aurelia, Webpack, Rollup, i18Next, GitHub</w:t>
+        <w:t xml:space="preserve">dApp Development, DAO Development, Product Development, End-to-End Product Ownership, TypeScript, Technical Leadership, Mentoring, Blockchain, Cryptocurrencies, DAO Governance Systems, Liquidity Bootstrapping Pools, Balancer Liquidity Pools, DeFi, ReFi, Web3, Ethereum, Solidity, Wallets, Gnosis Safe, Metamask, WalletConnect, Web3Modal, ethers.js, web3.js, IPFS, Subgraph, Aurelia, React, SPA, Technical Interviewing, Code Review, Smart Contract Security Review, Defender, Ceramic, ENS, LitProtocol, JavaScript, Node.js, Vite, HTML, CSS, SASS, Responsive, Webpack, Rollup, i18Next, GitHub</w:t>
       </w:r>
     </w:p>
     <w:p>
@@ -2076,7 +2076,7 @@
         <w:spacing w:after="100"/>
       </w:pPr>
       <w:r>
-        <w:t xml:space="preserve">Blockchain, End-to-End Product Ownership, TypeScript, dApp Development, DAO Development, DAO Governance Systems, Web3, Ethereum, Solidity, Wallets, Subgraph, React, SPA, Prototyping, Smart Contract Deployment, 3Box, SDK/Library Design, JavaScript, Node.js, HTML, CSS, SASS, Responsive, Aurelia, Webpack, jQuery, Bootstrap, Bootstrap Material Design, GitHub</w:t>
+        <w:t xml:space="preserve">dApp Development, DAO Development, Product Development, End-to-End Product Ownership, TypeScript, Blockchain, DAO Governance Systems, Web3, Ethereum, Solidity, Wallets, Subgraph, Aurelia, React, SPA, Prototyping, Smart Contract Deployment, 3Box, SDK/Library Design, JavaScript, Node.js, HTML, CSS, SASS, Responsive, Webpack, jQuery, Bootstrap, Bootstrap Material Design, GitHub</w:t>
       </w:r>
     </w:p>
     <w:p>
@@ -2317,7 +2317,7 @@
         <w:spacing w:after="100"/>
       </w:pPr>
       <w:r>
-        <w:t xml:space="preserve">TypeScript, SPA, JavaScript, HTML, CSS, Responsive, Aurelia, C#, ASP.NET Core, WebApi, ASP.NET Identity, Ajax, jQuery, Bootstrap, Microsoft SQL Server, T-SQL, Unity, Entity Framework Core, Azure, TFS</w:t>
+        <w:t xml:space="preserve">TypeScript, Aurelia, SPA, JavaScript, HTML, CSS, Responsive, C#, ASP.NET Core, WebApi, ASP.NET Identity, Ajax, jQuery, Bootstrap, Microsoft SQL Server, T-SQL, Unity, Entity Framework Core, Azure, TFS</w:t>
       </w:r>
     </w:p>
     <w:p>
@@ -2836,7 +2836,7 @@
         <w:spacing w:after="100"/>
       </w:pPr>
       <w:r>
-        <w:t xml:space="preserve">crypto-js, SPA, JavaScript, HTML, CSS, Aurelia, Webpack, C#, ASP.NET Core, MVC, WebAPI, Identity, Ajax, jQuery, Bootstrap, RequireJS, KnockoutJS, SQL Server, T-SQL, MsTest, XUnit.NET, DES, Encryption, SHA, System.Security.Cryptography, entity framework</w:t>
+        <w:t xml:space="preserve">crypto-js, Aurelia, SPA, JavaScript, HTML, CSS, Webpack, C#, ASP.NET Core, MVC, WebAPI, Identity, Ajax, jQuery, Bootstrap, RequireJS, KnockoutJS, SQL Server, T-SQL, MsTest, XUnit.NET, DES, Encryption, SHA, System.Security.Cryptography, entity framework</w:t>
       </w:r>
     </w:p>
     <w:p>
@@ -3002,7 +3002,7 @@
         <w:spacing w:after="100"/>
       </w:pPr>
       <w:r>
-        <w:t xml:space="preserve">JavaScript, HTML, CSS, C#, MVC, jQuery, KnockoutJS, ASP.NET, Telerik, MEF, ADO, nHibernate, Agile, Moq, Selenium, SpecFlow, Unity, VSTest, Enterprise Framework, TFS</w:t>
+        <w:t xml:space="preserve">Product Development, JavaScript, HTML, CSS, C#, MVC, jQuery, KnockoutJS, ASP.NET, Telerik, MEF, ADO, nHibernate, Agile, Moq, Selenium, SpecFlow, Unity, VSTest, Enterprise Framework, TFS</w:t>
       </w:r>
     </w:p>
     <w:p>
@@ -3168,7 +3168,7 @@
         <w:spacing w:after="100"/>
       </w:pPr>
       <w:r>
-        <w:t xml:space="preserve">Team Leadership, Mentoring, Client Integration, Systems Integration, JavaScript, HTML, CSS, C#, XML, MVC, jQuery, ASP.NET, XSLT, XSD, WCF, WWF, SQL Server, T-SQL, LINQ, Agile, Moq, MSTest, NUnit, Entity Framework, Enterprise Framework, TFS</w:t>
+        <w:t xml:space="preserve">Product Development, Team Leadership, Mentoring, Client Integration, Systems Integration, JavaScript, HTML, CSS, C#, XML, MVC, jQuery, ASP.NET, XSLT, XSD, WCF, WWF, SQL Server, T-SQL, LINQ, Agile, Moq, MSTest, NUnit, Entity Framework, Enterprise Framework, TFS</w:t>
       </w:r>
     </w:p>
     <w:p>
@@ -3983,6 +3983,27 @@
     </w:p>
     <w:p>
       <w:pPr>
+        <w:keepNext/>
+        <w:spacing w:after="40" w:before="140"/>
+      </w:pPr>
+      <w:r>
+        <w:rPr>
+          <w:b/>
+          <w:bCs/>
+        </w:rPr>
+        <w:t xml:space="preserve">Skills / Technologies:</w:t>
+      </w:r>
+    </w:p>
+    <w:p>
+      <w:pPr>
+        <w:spacing w:after="100"/>
+      </w:pPr>
+      <w:r>
+        <w:t xml:space="preserve">Product Development</w:t>
+      </w:r>
+    </w:p>
+    <w:p>
+      <w:pPr>
         <w:pStyle w:val="Heading2"/>
         <w:keepNext/>
         <w:keepLines/>
@@ -4103,6 +4124,27 @@
     </w:p>
     <w:p>
       <w:pPr>
+        <w:keepNext/>
+        <w:spacing w:after="40" w:before="140"/>
+      </w:pPr>
+      <w:r>
+        <w:rPr>
+          <w:b/>
+          <w:bCs/>
+        </w:rPr>
+        <w:t xml:space="preserve">Skills / Technologies:</w:t>
+      </w:r>
+    </w:p>
+    <w:p>
+      <w:pPr>
+        <w:spacing w:after="100"/>
+      </w:pPr>
+      <w:r>
+        <w:t xml:space="preserve">Product Development</w:t>
+      </w:r>
+    </w:p>
+    <w:p>
+      <w:pPr>
         <w:pStyle w:val="Heading2"/>
         <w:keepNext/>
         <w:keepLines/>
@@ -4157,6 +4199,27 @@
     </w:p>
     <w:p>
       <w:pPr>
+        <w:keepNext/>
+        <w:spacing w:after="40" w:before="140"/>
+      </w:pPr>
+      <w:r>
+        <w:rPr>
+          <w:b/>
+          <w:bCs/>
+        </w:rPr>
+        <w:t xml:space="preserve">Skills / Technologies:</w:t>
+      </w:r>
+    </w:p>
+    <w:p>
+      <w:pPr>
+        <w:spacing w:after="100"/>
+      </w:pPr>
+      <w:r>
+        <w:t xml:space="preserve">Product Development</w:t>
+      </w:r>
+    </w:p>
+    <w:p>
+      <w:pPr>
         <w:pStyle w:val="Heading2"/>
         <w:keepNext/>
         <w:keepLines/>
@@ -4291,6 +4354,27 @@
     </w:p>
     <w:p>
       <w:pPr>
+        <w:keepNext/>
+        <w:spacing w:after="40" w:before="140"/>
+      </w:pPr>
+      <w:r>
+        <w:rPr>
+          <w:b/>
+          <w:bCs/>
+        </w:rPr>
+        <w:t xml:space="preserve">Skills / Technologies:</w:t>
+      </w:r>
+    </w:p>
+    <w:p>
+      <w:pPr>
+        <w:spacing w:after="100"/>
+      </w:pPr>
+      <w:r>
+        <w:t xml:space="preserve">Product Development</w:t>
+      </w:r>
+    </w:p>
+    <w:p>
+      <w:pPr>
         <w:pStyle w:val="Heading2"/>
         <w:keepNext/>
         <w:keepLines/>
@@ -4435,6 +4519,27 @@
       </w:pPr>
       <w:r>
         <w:t xml:space="preserve">Ported Visuals (see UNC below) to the SAS Graphical User Interface System</w:t>
+      </w:r>
+    </w:p>
+    <w:p>
+      <w:pPr>
+        <w:keepNext/>
+        <w:spacing w:after="40" w:before="140"/>
+      </w:pPr>
+      <w:r>
+        <w:rPr>
+          <w:b/>
+          <w:bCs/>
+        </w:rPr>
+        <w:t xml:space="preserve">Skills / Technologies:</w:t>
+      </w:r>
+    </w:p>
+    <w:p>
+      <w:pPr>
+        <w:spacing w:after="100"/>
+      </w:pPr>
+      <w:r>
+        <w:t xml:space="preserve">Product Development</w:t>
       </w:r>
     </w:p>
     <w:p>

</xml_diff>